<commit_message>
adding all the exercise game design
</commit_message>
<xml_diff>
--- a/week_3/day3/Exercice _About_the_Game_Design.docx
+++ b/week_3/day3/Exercice _About_the_Game_Design.docx
@@ -11,8 +11,6 @@
           <w:lang w:val="en-US"/>
         </w:rPr>
       </w:pPr>
-      <w:proofErr w:type="spellStart"/>
-      <w:proofErr w:type="gramStart"/>
       <w:r>
         <w:rPr>
           <w:b/>
@@ -20,19 +18,491 @@
           <w:color w:val="EE0000"/>
           <w:lang w:val="en-US"/>
         </w:rPr>
-        <w:t>Exercice</w:t>
-      </w:r>
-      <w:proofErr w:type="spellEnd"/>
-      <w:r>
+        <w:t>Exercice : About the Game Design</w:t>
+      </w:r>
+    </w:p>
+    <w:p>
+      <w:pPr>
+        <w:rPr>
+          <w:b/>
+          <w:bCs/>
+          <w:lang w:val="en-US"/>
+        </w:rPr>
+      </w:pPr>
+      <w:r>
+        <w:rPr>
+          <w:b/>
+          <w:bCs/>
+          <w:lang w:val="en-US"/>
+        </w:rPr>
+        <w:t>1-</w:t>
+      </w:r>
+      <w:r>
+        <w:rPr>
+          <w:b/>
+          <w:bCs/>
+          <w:lang w:val="en-US"/>
+        </w:rPr>
+        <w:t>In 3 lines: goal, rules, core loop (Little Nightmares–style):</w:t>
+      </w:r>
+    </w:p>
+    <w:p>
+      <w:pPr>
+        <w:rPr>
+          <w:lang w:val="en-US"/>
+        </w:rPr>
+      </w:pPr>
+      <w:r>
+        <w:rPr>
+          <w:b/>
+          <w:bCs/>
+          <w:lang w:val="en-US"/>
+        </w:rPr>
+        <w:t>Goal</w:t>
+      </w:r>
+      <w:r>
+        <w:rPr>
+          <w:lang w:val="en-US"/>
+        </w:rPr>
+        <w:t>: The player must escape a dark and hostile world by avoiding monsters and solving environmental puzzles</w:t>
+      </w:r>
+    </w:p>
+    <w:p>
+      <w:pPr>
+        <w:rPr>
+          <w:lang w:val="en-US"/>
+        </w:rPr>
+      </w:pPr>
+      <w:r>
+        <w:rPr>
+          <w:b/>
+          <w:bCs/>
+          <w:lang w:val="en-US"/>
+        </w:rPr>
+        <w:t>Rules</w:t>
+      </w:r>
+      <w:r>
+        <w:rPr>
+          <w:lang w:val="en-US"/>
+        </w:rPr>
+        <w:t>: The player cannot fight enemies and must rely on stealth, hiding, and timing to survive</w:t>
+      </w:r>
+    </w:p>
+    <w:p>
+      <w:pPr>
+        <w:rPr>
+          <w:lang w:val="en-US"/>
+        </w:rPr>
+      </w:pPr>
+      <w:r>
+        <w:rPr>
+          <w:b/>
+          <w:bCs/>
+          <w:lang w:val="en-US"/>
+        </w:rPr>
+        <w:t>Core Loop</w:t>
+      </w:r>
+      <w:r>
+        <w:rPr>
+          <w:lang w:val="en-US"/>
+        </w:rPr>
+        <w:t xml:space="preserve"> : Explore the area </w:t>
+      </w:r>
+      <w:r>
+        <w:rPr>
+          <w:lang w:val="en-US"/>
+        </w:rPr>
+        <w:t xml:space="preserve">and than </w:t>
+      </w:r>
+      <w:r>
+        <w:rPr>
+          <w:lang w:val="en-US"/>
+        </w:rPr>
+        <w:t xml:space="preserve">solve a puzzle </w:t>
+      </w:r>
+      <w:r>
+        <w:rPr>
+          <w:lang w:val="en-US"/>
+        </w:rPr>
+        <w:t xml:space="preserve">and try to </w:t>
+      </w:r>
+      <w:r>
+        <w:rPr>
+          <w:lang w:val="en-US"/>
+        </w:rPr>
+        <w:t xml:space="preserve">avoid enemies </w:t>
+      </w:r>
+      <w:r>
+        <w:rPr>
+          <w:lang w:val="en-US"/>
+        </w:rPr>
+        <w:t xml:space="preserve">and also </w:t>
+      </w:r>
+      <w:r>
+        <w:rPr>
+          <w:lang w:val="en-US"/>
+        </w:rPr>
+        <w:t>move to the next disturbing environment</w:t>
+      </w:r>
+    </w:p>
+    <w:p>
+      <w:pPr>
+        <w:rPr>
+          <w:b/>
+          <w:bCs/>
+          <w:lang w:val="en-US"/>
+        </w:rPr>
+      </w:pPr>
+      <w:r>
+        <w:rPr>
+          <w:b/>
+          <w:bCs/>
+          <w:lang w:val="en-US"/>
+        </w:rPr>
+        <w:t>2-</w:t>
+      </w:r>
+      <w:r>
+        <w:rPr>
+          <w:b/>
+          <w:bCs/>
+          <w:lang w:val="en-US"/>
+        </w:rPr>
+        <w:t>Add 1 simple feedback (visual or sound)</w:t>
+      </w:r>
+      <w:r>
+        <w:rPr>
+          <w:b/>
+          <w:bCs/>
+          <w:lang w:val="en-US"/>
+        </w:rPr>
+        <w:t>:</w:t>
+      </w:r>
+    </w:p>
+    <w:p>
+      <w:pPr>
+        <w:rPr>
+          <w:color w:val="000000" w:themeColor="text1"/>
+          <w:lang w:val="en-US"/>
+        </w:rPr>
+      </w:pPr>
+      <w:r>
+        <w:rPr>
+          <w:b/>
+          <w:bCs/>
+          <w:color w:val="000000" w:themeColor="text1"/>
+          <w:lang w:val="en-US"/>
+        </w:rPr>
+        <w:t>Feedback :</w:t>
+      </w:r>
+      <w:r>
+        <w:rPr>
+          <w:lang w:val="en-US"/>
+        </w:rPr>
+        <w:t xml:space="preserve"> </w:t>
+      </w:r>
+      <w:r>
+        <w:rPr>
+          <w:color w:val="000000" w:themeColor="text1"/>
+          <w:lang w:val="en-US"/>
+        </w:rPr>
+        <w:t>When the player gets detected by an enemy, the screen slightly darkens and a tense sound plays to warn the</w:t>
+      </w:r>
+      <w:r>
+        <w:rPr>
+          <w:color w:val="000000" w:themeColor="text1"/>
+          <w:lang w:val="en-US"/>
+        </w:rPr>
+        <w:t xml:space="preserve"> player .</w:t>
+      </w:r>
+    </w:p>
+    <w:p>
+      <w:pPr>
+        <w:rPr>
+          <w:color w:val="000000" w:themeColor="text1"/>
+          <w:lang w:val="en-US"/>
+        </w:rPr>
+      </w:pPr>
+      <w:r>
+        <w:rPr>
+          <w:b/>
+          <w:bCs/>
+          <w:color w:val="000000" w:themeColor="text1"/>
+          <w:lang w:val="en-US"/>
+        </w:rPr>
+        <w:t>3-</w:t>
+      </w:r>
+      <w:r>
+        <w:rPr>
+          <w:b/>
+          <w:bCs/>
+          <w:color w:val="000000" w:themeColor="text1"/>
+          <w:lang w:val="en-US"/>
+        </w:rPr>
+        <w:t>SCAMPER on Little Nightmares</w:t>
+      </w:r>
+      <w:r>
+        <w:rPr>
+          <w:color w:val="000000" w:themeColor="text1"/>
+          <w:lang w:val="en-US"/>
+        </w:rPr>
+        <w:t> :</w:t>
+      </w:r>
+    </w:p>
+    <w:p>
+      <w:pPr>
+        <w:rPr>
+          <w:color w:val="215E99" w:themeColor="text2" w:themeTint="BF"/>
+          <w:lang w:val="en-US"/>
+        </w:rPr>
+      </w:pPr>
+      <w:r>
+        <w:rPr>
+          <w:color w:val="215E99" w:themeColor="text2" w:themeTint="BF"/>
+          <w:lang w:val="en-US"/>
+        </w:rPr>
+        <w:t xml:space="preserve">         S – Substitute :</w:t>
+      </w:r>
+    </w:p>
+    <w:p>
+      <w:pPr>
+        <w:rPr>
+          <w:color w:val="000000" w:themeColor="text1"/>
+          <w:lang w:val="en-US"/>
+        </w:rPr>
+      </w:pPr>
+      <w:r>
+        <w:rPr>
+          <w:color w:val="000000" w:themeColor="text1"/>
+          <w:lang w:val="en-US"/>
+        </w:rPr>
+        <w:t>Replace the child character with a fragile shadow creature that can dissolve in darkness</w:t>
+      </w:r>
+    </w:p>
+    <w:p>
+      <w:pPr>
+        <w:rPr>
+          <w:color w:val="000000" w:themeColor="text1"/>
+          <w:lang w:val="en-US"/>
+        </w:rPr>
+      </w:pPr>
+      <w:r>
+        <w:rPr>
+          <w:color w:val="000000" w:themeColor="text1"/>
+          <w:lang w:val="en-US"/>
+        </w:rPr>
+        <w:t xml:space="preserve">        </w:t>
+      </w:r>
+      <w:r>
+        <w:rPr>
+          <w:color w:val="215E99" w:themeColor="text2" w:themeTint="BF"/>
+          <w:lang w:val="en-US"/>
+        </w:rPr>
+        <w:t>C – Combine :</w:t>
+      </w:r>
+    </w:p>
+    <w:p>
+      <w:pPr>
+        <w:rPr>
+          <w:color w:val="000000" w:themeColor="text1"/>
+          <w:lang w:val="en-US"/>
+        </w:rPr>
+      </w:pPr>
+      <w:r>
+        <w:rPr>
+          <w:color w:val="000000" w:themeColor="text1"/>
+          <w:lang w:val="en-US"/>
+        </w:rPr>
+        <w:t>Combine Little Nightmares with a time-loop mechanic where the world resets after each death</w:t>
+      </w:r>
+    </w:p>
+    <w:p>
+      <w:pPr>
+        <w:rPr>
+          <w:color w:val="000000" w:themeColor="text1"/>
+          <w:lang w:val="en-US"/>
+        </w:rPr>
+      </w:pPr>
+      <w:r>
+        <w:rPr>
+          <w:color w:val="000000" w:themeColor="text1"/>
+          <w:lang w:val="en-US"/>
+        </w:rPr>
+        <w:t xml:space="preserve">         </w:t>
+      </w:r>
+      <w:r>
+        <w:rPr>
+          <w:color w:val="215E99" w:themeColor="text2" w:themeTint="BF"/>
+          <w:lang w:val="en-US"/>
+        </w:rPr>
+        <w:t>A – Adapt :</w:t>
+      </w:r>
+    </w:p>
+    <w:p>
+      <w:pPr>
+        <w:rPr>
+          <w:color w:val="000000" w:themeColor="text1"/>
+          <w:lang w:val="en-US"/>
+        </w:rPr>
+      </w:pPr>
+      <w:r>
+        <w:rPr>
+          <w:color w:val="000000" w:themeColor="text1"/>
+          <w:lang w:val="en-US"/>
+        </w:rPr>
+        <w:t>Adapt a sanity system from horror games where fear affects movement and perception</w:t>
+      </w:r>
+    </w:p>
+    <w:p>
+      <w:pPr>
+        <w:rPr>
+          <w:color w:val="215E99" w:themeColor="text2" w:themeTint="BF"/>
+          <w:lang w:val="en-US"/>
+        </w:rPr>
+      </w:pPr>
+      <w:r>
+        <w:rPr>
+          <w:color w:val="215E99" w:themeColor="text2" w:themeTint="BF"/>
+          <w:lang w:val="en-US"/>
+        </w:rPr>
+        <w:t xml:space="preserve">         </w:t>
+      </w:r>
+      <w:r>
+        <w:rPr>
+          <w:color w:val="215E99" w:themeColor="text2" w:themeTint="BF"/>
+          <w:lang w:val="en-US"/>
+        </w:rPr>
+        <w:t>M – Modify :</w:t>
+      </w:r>
+    </w:p>
+    <w:p>
+      <w:pPr>
+        <w:rPr>
+          <w:color w:val="000000" w:themeColor="text1"/>
+          <w:lang w:val="en-US"/>
+        </w:rPr>
+      </w:pPr>
+      <w:r>
+        <w:rPr>
+          <w:color w:val="000000" w:themeColor="text1"/>
+          <w:lang w:val="en-US"/>
+        </w:rPr>
+        <w:t>Make the environment slowly shrink, forcing the player to move faster and take risks</w:t>
+      </w:r>
+    </w:p>
+    <w:p>
+      <w:pPr>
+        <w:rPr>
+          <w:color w:val="215E99" w:themeColor="text2" w:themeTint="BF"/>
+          <w:lang w:val="en-US"/>
+        </w:rPr>
+      </w:pPr>
+      <w:r>
+        <w:rPr>
+          <w:color w:val="215E99" w:themeColor="text2" w:themeTint="BF"/>
+          <w:lang w:val="en-US"/>
+        </w:rPr>
+        <w:t xml:space="preserve">         P – Put to other use</w:t>
+      </w:r>
+    </w:p>
+    <w:p>
+      <w:pPr>
+        <w:rPr>
+          <w:color w:val="000000" w:themeColor="text1"/>
+          <w:lang w:val="en-US"/>
+        </w:rPr>
+      </w:pPr>
+      <w:r>
+        <w:rPr>
+          <w:color w:val="000000" w:themeColor="text1"/>
+          <w:lang w:val="en-US"/>
+        </w:rPr>
+        <w:t>Use light not only to reveal paths but also to weaken enemies temporarily</w:t>
+      </w:r>
+    </w:p>
+    <w:p>
+      <w:pPr>
+        <w:rPr>
+          <w:color w:val="000000" w:themeColor="text1"/>
+          <w:lang w:val="en-US"/>
+        </w:rPr>
+      </w:pPr>
+      <w:r>
+        <w:rPr>
+          <w:color w:val="000000" w:themeColor="text1"/>
+          <w:lang w:val="en-US"/>
+        </w:rPr>
+        <w:t xml:space="preserve">          </w:t>
+      </w:r>
+      <w:r>
+        <w:rPr>
+          <w:color w:val="215E99" w:themeColor="text2" w:themeTint="BF"/>
+          <w:lang w:val="en-US"/>
+        </w:rPr>
+        <w:t>E – Eliminate :</w:t>
+      </w:r>
+    </w:p>
+    <w:p>
+      <w:pPr>
+        <w:rPr>
+          <w:color w:val="000000" w:themeColor="text1"/>
+          <w:lang w:val="en-US"/>
+        </w:rPr>
+      </w:pPr>
+      <w:r>
+        <w:rPr>
+          <w:color w:val="000000" w:themeColor="text1"/>
+          <w:lang w:val="en-US"/>
+        </w:rPr>
+        <w:t>Eliminate UI completely to increase immersion and tension</w:t>
+      </w:r>
+    </w:p>
+    <w:p>
+      <w:pPr>
+        <w:rPr>
+          <w:color w:val="215E99" w:themeColor="text2" w:themeTint="BF"/>
+          <w:lang w:val="en-US"/>
+        </w:rPr>
+      </w:pPr>
+      <w:r>
+        <w:rPr>
+          <w:color w:val="215E99" w:themeColor="text2" w:themeTint="BF"/>
+          <w:lang w:val="en-US"/>
+        </w:rPr>
+        <w:t xml:space="preserve">           R – Reverse:</w:t>
+      </w:r>
+    </w:p>
+    <w:p>
+      <w:pPr>
+        <w:rPr>
+          <w:color w:val="000000" w:themeColor="text1"/>
+          <w:lang w:val="en-US"/>
+        </w:rPr>
+      </w:pPr>
+      <w:r>
+        <w:rPr>
+          <w:color w:val="000000" w:themeColor="text1"/>
+          <w:lang w:val="en-US"/>
+        </w:rPr>
+        <w:t>Instead of escaping monsters, the player must guide monsters away to unlock new paths.</w:t>
+      </w:r>
+    </w:p>
+    <w:p>
+      <w:pPr>
+        <w:rPr>
+          <w:color w:val="000000" w:themeColor="text1"/>
+          <w:lang w:val="en-US"/>
+        </w:rPr>
+      </w:pPr>
+    </w:p>
+    <w:p>
+      <w:pPr>
         <w:rPr>
           <w:b/>
           <w:bCs/>
           <w:color w:val="EE0000"/>
           <w:lang w:val="en-US"/>
         </w:rPr>
-        <w:t xml:space="preserve"> :</w:t>
-      </w:r>
-      <w:proofErr w:type="gramEnd"/>
+      </w:pPr>
       <w:r>
         <w:rPr>
           <w:b/>
@@ -40,19 +510,222 @@
           <w:color w:val="EE0000"/>
           <w:lang w:val="en-US"/>
         </w:rPr>
-        <w:t xml:space="preserve"> About </w:t>
-      </w:r>
-      <w:proofErr w:type="gramStart"/>
-      <w:r>
+        <w:t>Exercice: About the Game</w:t>
+      </w:r>
+    </w:p>
+    <w:p>
+      <w:pPr>
+        <w:rPr>
+          <w:b/>
+          <w:bCs/>
+          <w:color w:val="215E99" w:themeColor="text2" w:themeTint="BF"/>
+          <w:lang w:val="en-US"/>
+        </w:rPr>
+      </w:pPr>
+      <w:r>
+        <w:rPr>
+          <w:b/>
+          <w:bCs/>
+          <w:color w:val="215E99" w:themeColor="text2" w:themeTint="BF"/>
+          <w:lang w:val="en-US"/>
+        </w:rPr>
+        <w:lastRenderedPageBreak/>
+        <w:t>Idea (Player → Verb → Goal) :</w:t>
+      </w:r>
+    </w:p>
+    <w:p>
+      <w:pPr>
+        <w:rPr>
+          <w:color w:val="000000" w:themeColor="text1"/>
+          <w:lang w:val="en-US"/>
+        </w:rPr>
+      </w:pPr>
+      <w:r>
+        <w:rPr>
+          <w:b/>
+          <w:bCs/>
+          <w:color w:val="000000" w:themeColor="text1"/>
+          <w:lang w:val="en-US"/>
+        </w:rPr>
+        <w:t>Goal</w:t>
+      </w:r>
+      <w:r>
+        <w:rPr>
+          <w:color w:val="000000" w:themeColor="text1"/>
+          <w:lang w:val="en-US"/>
+        </w:rPr>
+        <w:t> :   Escape the level without getting caught</w:t>
+      </w:r>
+    </w:p>
+    <w:p>
+      <w:pPr>
+        <w:rPr>
+          <w:color w:val="000000" w:themeColor="text1"/>
+          <w:lang w:val="en-US"/>
+        </w:rPr>
+      </w:pPr>
+      <w:r>
+        <w:rPr>
+          <w:b/>
+          <w:bCs/>
+          <w:color w:val="000000" w:themeColor="text1"/>
+          <w:lang w:val="en-US"/>
+        </w:rPr>
+        <w:t>Rules</w:t>
+      </w:r>
+      <w:r>
+        <w:rPr>
+          <w:color w:val="000000" w:themeColor="text1"/>
+          <w:lang w:val="en-US"/>
+        </w:rPr>
+        <w:t> :</w:t>
+      </w:r>
+    </w:p>
+    <w:p>
+      <w:pPr>
+        <w:rPr>
+          <w:color w:val="000000" w:themeColor="text1"/>
+          <w:lang w:val="en-US"/>
+        </w:rPr>
+      </w:pPr>
+      <w:r>
+        <w:rPr>
+          <w:color w:val="000000" w:themeColor="text1"/>
+          <w:lang w:val="en-US"/>
+        </w:rPr>
+        <w:t>1. The player cannot fight enemies.</w:t>
+      </w:r>
+    </w:p>
+    <w:p>
+      <w:pPr>
+        <w:rPr>
+          <w:color w:val="000000" w:themeColor="text1"/>
+          <w:lang w:val="en-US"/>
+        </w:rPr>
+      </w:pPr>
+      <w:r>
+        <w:rPr>
+          <w:color w:val="000000" w:themeColor="text1"/>
+          <w:lang w:val="en-US"/>
+        </w:rPr>
+        <w:t xml:space="preserve">2. </w:t>
+      </w:r>
+      <w:r>
+        <w:rPr>
+          <w:color w:val="000000" w:themeColor="text1"/>
+          <w:lang w:val="en-US"/>
+        </w:rPr>
+        <w:t>The player must hide and move quietly.</w:t>
+      </w:r>
+    </w:p>
+    <w:p>
+      <w:pPr>
+        <w:rPr>
+          <w:color w:val="000000" w:themeColor="text1"/>
+          <w:lang w:val="en-US"/>
+        </w:rPr>
+      </w:pPr>
+      <w:r>
+        <w:rPr>
+          <w:b/>
+          <w:bCs/>
+          <w:color w:val="000000" w:themeColor="text1"/>
+          <w:lang w:val="en-US"/>
+        </w:rPr>
+        <w:t>Feedback</w:t>
+      </w:r>
+      <w:r>
+        <w:rPr>
+          <w:color w:val="000000" w:themeColor="text1"/>
+          <w:lang w:val="en-US"/>
+        </w:rPr>
+        <w:t> :</w:t>
+      </w:r>
+    </w:p>
+    <w:p>
+      <w:pPr>
+        <w:rPr>
+          <w:color w:val="000000" w:themeColor="text1"/>
+          <w:lang w:val="en-US"/>
+        </w:rPr>
+      </w:pPr>
+      <w:r>
+        <w:rPr>
+          <w:color w:val="000000" w:themeColor="text1"/>
+          <w:lang w:val="en-US"/>
+        </w:rPr>
+        <w:t>A scary sound plays when an enemy is close.</w:t>
+      </w:r>
+    </w:p>
+    <w:p>
+      <w:pPr>
+        <w:rPr>
+          <w:b/>
+          <w:bCs/>
+          <w:color w:val="215E99" w:themeColor="text2" w:themeTint="BF"/>
+        </w:rPr>
+      </w:pPr>
+      <w:r>
+        <w:rPr>
+          <w:b/>
+          <w:bCs/>
+          <w:color w:val="215E99" w:themeColor="text2" w:themeTint="BF"/>
+        </w:rPr>
+        <w:t>Rule Change &amp; Effect :</w:t>
+      </w:r>
+    </w:p>
+    <w:p>
+      <w:pPr>
+        <w:rPr>
+          <w:color w:val="000000" w:themeColor="text1"/>
+          <w:lang w:val="en-US"/>
+        </w:rPr>
+      </w:pPr>
+      <w:r>
+        <w:rPr>
+          <w:color w:val="000000" w:themeColor="text1"/>
+          <w:lang w:val="en-US"/>
+        </w:rPr>
+        <w:t>If the player can fight enemies</w:t>
+      </w:r>
+      <w:r>
+        <w:rPr>
+          <w:color w:val="000000" w:themeColor="text1"/>
+          <w:lang w:val="en-US"/>
+        </w:rPr>
+        <w:t xml:space="preserve"> </w:t>
+      </w:r>
+      <w:r>
+        <w:rPr>
+          <w:color w:val="000000" w:themeColor="text1"/>
+          <w:lang w:val="en-US"/>
+        </w:rPr>
+        <w:t xml:space="preserve"> the game becomes less scary and more action-focused</w:t>
+      </w:r>
+      <w:r>
+        <w:rPr>
+          <w:color w:val="000000" w:themeColor="text1"/>
+          <w:lang w:val="en-US"/>
+        </w:rPr>
+        <w:t xml:space="preserve"> </w:t>
+      </w:r>
+      <w:r>
+        <w:rPr>
+          <w:color w:val="000000" w:themeColor="text1"/>
+          <w:lang w:val="en-US"/>
+        </w:rPr>
+        <w:t>.</w:t>
+      </w:r>
+    </w:p>
+    <w:p>
+      <w:pPr>
         <w:rPr>
           <w:b/>
           <w:bCs/>
           <w:color w:val="EE0000"/>
           <w:lang w:val="en-US"/>
         </w:rPr>
-        <w:t>the Game</w:t>
-      </w:r>
-      <w:proofErr w:type="gramEnd"/>
+      </w:pPr>
       <w:r>
         <w:rPr>
           <w:b/>
@@ -60,1039 +733,29 @@
           <w:color w:val="EE0000"/>
           <w:lang w:val="en-US"/>
         </w:rPr>
-        <w:t xml:space="preserve"> Design</w:t>
-      </w:r>
-    </w:p>
-    <w:p>
-      <w:pPr>
-        <w:rPr>
-          <w:b/>
-          <w:bCs/>
-          <w:lang w:val="en-US"/>
-        </w:rPr>
-      </w:pPr>
-      <w:r>
-        <w:rPr>
-          <w:b/>
-          <w:bCs/>
-          <w:lang w:val="en-US"/>
-        </w:rPr>
-        <w:t>1-</w:t>
-      </w:r>
-      <w:r>
-        <w:rPr>
-          <w:b/>
-          <w:bCs/>
-          <w:lang w:val="en-US"/>
-        </w:rPr>
-        <w:t>In 3 lines: goal, rules, core loop (Little Nightmares–style)</w:t>
-      </w:r>
-      <w:r>
-        <w:rPr>
-          <w:b/>
-          <w:bCs/>
-          <w:lang w:val="en-US"/>
-        </w:rPr>
-        <w:t>:</w:t>
-      </w:r>
-    </w:p>
-    <w:p>
-      <w:pPr>
-        <w:rPr>
-          <w:lang w:val="en-US"/>
-        </w:rPr>
-      </w:pPr>
-      <w:r>
-        <w:rPr>
-          <w:b/>
-          <w:bCs/>
-          <w:lang w:val="en-US"/>
-        </w:rPr>
-        <w:t>Goal</w:t>
-      </w:r>
-      <w:r>
-        <w:rPr>
-          <w:lang w:val="en-US"/>
-        </w:rPr>
-        <w:t>:</w:t>
-      </w:r>
-      <w:r>
-        <w:rPr>
-          <w:lang w:val="en-US"/>
-        </w:rPr>
-        <w:t xml:space="preserve"> </w:t>
-      </w:r>
-      <w:r>
-        <w:rPr>
-          <w:lang w:val="en-US"/>
-        </w:rPr>
-        <w:t>The player must escape a dark and hostile world by avoiding monsters and solving environmental puzzles</w:t>
-      </w:r>
-    </w:p>
-    <w:p>
-      <w:pPr>
-        <w:rPr>
-          <w:lang w:val="en-US"/>
-        </w:rPr>
-      </w:pPr>
-      <w:r>
-        <w:rPr>
-          <w:b/>
-          <w:bCs/>
-          <w:lang w:val="en-US"/>
-        </w:rPr>
-        <w:t>Rules</w:t>
-      </w:r>
-      <w:r>
-        <w:rPr>
-          <w:lang w:val="en-US"/>
-        </w:rPr>
-        <w:t>:</w:t>
-      </w:r>
-      <w:r>
-        <w:rPr>
-          <w:lang w:val="en-US"/>
-        </w:rPr>
-        <w:t xml:space="preserve"> </w:t>
-      </w:r>
-      <w:r>
-        <w:rPr>
-          <w:lang w:val="en-US"/>
-        </w:rPr>
-        <w:t>The player cannot fight enemies and must rely on stealth, hiding, and timing to survive</w:t>
-      </w:r>
-    </w:p>
-    <w:p>
-      <w:pPr>
-        <w:rPr>
-          <w:lang w:val="en-US"/>
-        </w:rPr>
-      </w:pPr>
-      <w:r>
-        <w:rPr>
-          <w:b/>
-          <w:bCs/>
-          <w:lang w:val="en-US"/>
-        </w:rPr>
-        <w:t xml:space="preserve">Core </w:t>
-      </w:r>
-      <w:proofErr w:type="gramStart"/>
-      <w:r>
-        <w:rPr>
-          <w:b/>
-          <w:bCs/>
-          <w:lang w:val="en-US"/>
-        </w:rPr>
-        <w:t>Loop</w:t>
-      </w:r>
-      <w:r>
-        <w:rPr>
-          <w:lang w:val="en-US"/>
-        </w:rPr>
-        <w:t> :</w:t>
-      </w:r>
-      <w:proofErr w:type="gramEnd"/>
-      <w:r>
-        <w:rPr>
-          <w:lang w:val="en-US"/>
-        </w:rPr>
-        <w:t xml:space="preserve"> </w:t>
-      </w:r>
-      <w:r>
-        <w:rPr>
-          <w:lang w:val="en-US"/>
-        </w:rPr>
-        <w:t xml:space="preserve">Explore the area </w:t>
-      </w:r>
-      <w:proofErr w:type="spellStart"/>
-      <w:r>
-        <w:rPr>
-          <w:lang w:val="en-US"/>
-        </w:rPr>
-        <w:t xml:space="preserve">and </w:t>
-      </w:r>
-      <w:proofErr w:type="gramStart"/>
-      <w:r>
-        <w:rPr>
-          <w:lang w:val="en-US"/>
-        </w:rPr>
-        <w:t>than</w:t>
-      </w:r>
-      <w:proofErr w:type="spellEnd"/>
-      <w:proofErr w:type="gramEnd"/>
-      <w:r>
-        <w:rPr>
-          <w:lang w:val="en-US"/>
-        </w:rPr>
-        <w:t xml:space="preserve"> </w:t>
-      </w:r>
-      <w:r>
-        <w:rPr>
-          <w:lang w:val="en-US"/>
-        </w:rPr>
-        <w:t xml:space="preserve">solve a puzzle </w:t>
-      </w:r>
-      <w:r>
-        <w:rPr>
-          <w:lang w:val="en-US"/>
-        </w:rPr>
-        <w:t xml:space="preserve">and try to </w:t>
-      </w:r>
-      <w:r>
-        <w:rPr>
-          <w:lang w:val="en-US"/>
-        </w:rPr>
-        <w:t xml:space="preserve">avoid enemies </w:t>
-      </w:r>
-      <w:proofErr w:type="gramStart"/>
-      <w:r>
-        <w:rPr>
-          <w:lang w:val="en-US"/>
-        </w:rPr>
-        <w:t>and also</w:t>
-      </w:r>
-      <w:proofErr w:type="gramEnd"/>
-      <w:r>
-        <w:rPr>
-          <w:lang w:val="en-US"/>
-        </w:rPr>
-        <w:t xml:space="preserve"> </w:t>
-      </w:r>
-      <w:r>
-        <w:rPr>
-          <w:lang w:val="en-US"/>
-        </w:rPr>
-        <w:t>move to the next disturbing environment</w:t>
-      </w:r>
-    </w:p>
-    <w:p>
-      <w:pPr>
-        <w:rPr>
-          <w:b/>
-          <w:bCs/>
-          <w:lang w:val="en-US"/>
-        </w:rPr>
-      </w:pPr>
-      <w:r>
-        <w:rPr>
-          <w:b/>
-          <w:bCs/>
-          <w:lang w:val="en-US"/>
-        </w:rPr>
-        <w:t>2-</w:t>
-      </w:r>
-      <w:r>
-        <w:rPr>
-          <w:b/>
-          <w:bCs/>
-          <w:lang w:val="en-US"/>
-        </w:rPr>
-        <w:t>Add 1 simple feedback (visual or sound)</w:t>
-      </w:r>
-      <w:r>
-        <w:rPr>
-          <w:b/>
-          <w:bCs/>
-          <w:lang w:val="en-US"/>
-        </w:rPr>
-        <w:t>:</w:t>
-      </w:r>
-    </w:p>
-    <w:p>
-      <w:pPr>
-        <w:rPr>
-          <w:color w:val="000000" w:themeColor="text1"/>
-          <w:lang w:val="en-US"/>
-        </w:rPr>
-      </w:pPr>
-      <w:proofErr w:type="gramStart"/>
-      <w:r>
-        <w:rPr>
-          <w:b/>
-          <w:bCs/>
-          <w:color w:val="000000" w:themeColor="text1"/>
-          <w:lang w:val="en-US"/>
-        </w:rPr>
-        <w:t>Feedback</w:t>
-      </w:r>
-      <w:r>
-        <w:rPr>
-          <w:b/>
-          <w:bCs/>
-          <w:color w:val="000000" w:themeColor="text1"/>
-          <w:lang w:val="en-US"/>
-        </w:rPr>
-        <w:t> :</w:t>
-      </w:r>
-      <w:proofErr w:type="gramEnd"/>
-      <w:r>
-        <w:rPr>
-          <w:lang w:val="en-US"/>
-        </w:rPr>
-        <w:t xml:space="preserve"> </w:t>
-      </w:r>
-      <w:r>
-        <w:rPr>
-          <w:color w:val="000000" w:themeColor="text1"/>
-          <w:lang w:val="en-US"/>
-        </w:rPr>
-        <w:t>When the player gets detected by an enemy, the screen slightly darkens and a tense sound plays to warn the</w:t>
-      </w:r>
-      <w:r>
-        <w:rPr>
-          <w:color w:val="000000" w:themeColor="text1"/>
-          <w:lang w:val="en-US"/>
-        </w:rPr>
-        <w:t xml:space="preserve"> </w:t>
-      </w:r>
-      <w:proofErr w:type="gramStart"/>
-      <w:r>
-        <w:rPr>
-          <w:color w:val="000000" w:themeColor="text1"/>
-          <w:lang w:val="en-US"/>
-        </w:rPr>
-        <w:t>player .</w:t>
-      </w:r>
-      <w:proofErr w:type="gramEnd"/>
-    </w:p>
-    <w:p>
-      <w:pPr>
-        <w:rPr>
-          <w:color w:val="000000" w:themeColor="text1"/>
-        </w:rPr>
-      </w:pPr>
-      <w:r>
-        <w:rPr>
-          <w:b/>
-          <w:bCs/>
-          <w:color w:val="000000" w:themeColor="text1"/>
-          <w:lang w:val="en-US"/>
-        </w:rPr>
-        <w:t>3-</w:t>
-      </w:r>
-      <w:r>
-        <w:rPr>
-          <w:b/>
-          <w:bCs/>
-          <w:color w:val="000000" w:themeColor="text1"/>
-        </w:rPr>
-        <w:t xml:space="preserve">SCAMPER on Little </w:t>
-      </w:r>
-      <w:proofErr w:type="spellStart"/>
-      <w:proofErr w:type="gramStart"/>
-      <w:r>
-        <w:rPr>
-          <w:b/>
-          <w:bCs/>
-          <w:color w:val="000000" w:themeColor="text1"/>
-        </w:rPr>
-        <w:t>Nightmares</w:t>
-      </w:r>
-      <w:proofErr w:type="spellEnd"/>
-      <w:r>
-        <w:rPr>
-          <w:color w:val="000000" w:themeColor="text1"/>
-        </w:rPr>
-        <w:t> :</w:t>
-      </w:r>
-      <w:proofErr w:type="gramEnd"/>
+        <w:t>Exercice : Pillars</w:t>
+      </w:r>
     </w:p>
     <w:p>
       <w:pPr>
         <w:rPr>
           <w:color w:val="215E99" w:themeColor="text2" w:themeTint="BF"/>
+          <w:lang w:val="en-US"/>
         </w:rPr>
       </w:pPr>
       <w:r>
         <w:rPr>
           <w:color w:val="215E99" w:themeColor="text2" w:themeTint="BF"/>
-        </w:rPr>
-        <w:t xml:space="preserve">         </w:t>
+          <w:lang w:val="en-US"/>
+        </w:rPr>
+        <w:t>1.</w:t>
       </w:r>
       <w:r>
         <w:rPr>
           <w:color w:val="215E99" w:themeColor="text2" w:themeTint="BF"/>
-        </w:rPr>
-        <w:t>S – Substitute</w:t>
-      </w:r>
-      <w:r>
-        <w:rPr>
-          <w:color w:val="215E99" w:themeColor="text2" w:themeTint="BF"/>
-        </w:rPr>
-        <w:t> :</w:t>
-      </w:r>
-    </w:p>
-    <w:p>
-      <w:pPr>
-        <w:rPr>
-          <w:color w:val="000000" w:themeColor="text1"/>
-          <w:lang w:val="en-US"/>
-        </w:rPr>
-      </w:pPr>
-      <w:r>
-        <w:rPr>
-          <w:color w:val="000000" w:themeColor="text1"/>
-          <w:lang w:val="en-US"/>
-        </w:rPr>
-        <w:t>Replace the child character with a fragile shadow creature that can dissolve in darkness</w:t>
-      </w:r>
-    </w:p>
-    <w:p>
-      <w:pPr>
-        <w:rPr>
-          <w:color w:val="000000" w:themeColor="text1"/>
-        </w:rPr>
-      </w:pPr>
-      <w:r>
-        <w:rPr>
-          <w:color w:val="000000" w:themeColor="text1"/>
-          <w:lang w:val="en-US"/>
-        </w:rPr>
-        <w:t xml:space="preserve">        </w:t>
-      </w:r>
-      <w:r>
-        <w:rPr>
-          <w:color w:val="215E99" w:themeColor="text2" w:themeTint="BF"/>
-        </w:rPr>
-        <w:t>C – Combine</w:t>
-      </w:r>
-      <w:r>
-        <w:rPr>
-          <w:color w:val="215E99" w:themeColor="text2" w:themeTint="BF"/>
-        </w:rPr>
-        <w:t> :</w:t>
-      </w:r>
-    </w:p>
-    <w:p>
-      <w:pPr>
-        <w:rPr>
-          <w:color w:val="000000" w:themeColor="text1"/>
-          <w:lang w:val="en-US"/>
-        </w:rPr>
-      </w:pPr>
-      <w:r>
-        <w:rPr>
-          <w:color w:val="000000" w:themeColor="text1"/>
-          <w:lang w:val="en-US"/>
-        </w:rPr>
-        <w:t>Combine Little Nightmares with a time-loop mechanic where the world resets after each death</w:t>
-      </w:r>
-    </w:p>
-    <w:p>
-      <w:pPr>
-        <w:rPr>
-          <w:color w:val="000000" w:themeColor="text1"/>
-        </w:rPr>
-      </w:pPr>
-      <w:r>
-        <w:rPr>
-          <w:color w:val="000000" w:themeColor="text1"/>
-          <w:lang w:val="en-US"/>
-        </w:rPr>
-        <w:t xml:space="preserve">         </w:t>
-      </w:r>
-      <w:r>
-        <w:rPr>
-          <w:color w:val="215E99" w:themeColor="text2" w:themeTint="BF"/>
-        </w:rPr>
-        <w:t xml:space="preserve">A – </w:t>
-      </w:r>
-      <w:proofErr w:type="spellStart"/>
-      <w:r>
-        <w:rPr>
-          <w:color w:val="215E99" w:themeColor="text2" w:themeTint="BF"/>
-        </w:rPr>
-        <w:t>Adapt</w:t>
-      </w:r>
-      <w:proofErr w:type="spellEnd"/>
-      <w:r>
-        <w:rPr>
-          <w:color w:val="215E99" w:themeColor="text2" w:themeTint="BF"/>
-        </w:rPr>
-        <w:t> :</w:t>
-      </w:r>
-    </w:p>
-    <w:p>
-      <w:pPr>
-        <w:rPr>
-          <w:color w:val="000000" w:themeColor="text1"/>
-          <w:lang w:val="en-US"/>
-        </w:rPr>
-      </w:pPr>
-      <w:r>
-        <w:rPr>
-          <w:color w:val="000000" w:themeColor="text1"/>
-          <w:lang w:val="en-US"/>
-        </w:rPr>
-        <w:t>Adapt a sanity system from horror games where fear affects movement and perception</w:t>
-      </w:r>
-    </w:p>
-    <w:p>
-      <w:pPr>
-        <w:rPr>
-          <w:color w:val="215E99" w:themeColor="text2" w:themeTint="BF"/>
-        </w:rPr>
-      </w:pPr>
-      <w:r>
-        <w:rPr>
-          <w:color w:val="215E99" w:themeColor="text2" w:themeTint="BF"/>
-          <w:lang w:val="en-US"/>
-        </w:rPr>
-        <w:t xml:space="preserve">         </w:t>
-      </w:r>
-      <w:r>
-        <w:rPr>
-          <w:color w:val="215E99" w:themeColor="text2" w:themeTint="BF"/>
-        </w:rPr>
-        <w:t xml:space="preserve">M – </w:t>
-      </w:r>
-      <w:proofErr w:type="spellStart"/>
-      <w:r>
-        <w:rPr>
-          <w:color w:val="215E99" w:themeColor="text2" w:themeTint="BF"/>
-        </w:rPr>
-        <w:t>Modify</w:t>
-      </w:r>
-      <w:proofErr w:type="spellEnd"/>
-      <w:r>
-        <w:rPr>
-          <w:color w:val="215E99" w:themeColor="text2" w:themeTint="BF"/>
-        </w:rPr>
-        <w:t> :</w:t>
-      </w:r>
-    </w:p>
-    <w:p>
-      <w:pPr>
-        <w:rPr>
-          <w:color w:val="000000" w:themeColor="text1"/>
-          <w:lang w:val="en-US"/>
-        </w:rPr>
-      </w:pPr>
-      <w:r>
-        <w:rPr>
-          <w:color w:val="000000" w:themeColor="text1"/>
-          <w:lang w:val="en-US"/>
-        </w:rPr>
-        <w:t>Make the environment slowly shrink, forcing the player to move faster and take risks</w:t>
-      </w:r>
-    </w:p>
-    <w:p>
-      <w:pPr>
-        <w:rPr>
-          <w:color w:val="215E99" w:themeColor="text2" w:themeTint="BF"/>
-          <w:lang w:val="en-US"/>
-        </w:rPr>
-      </w:pPr>
-      <w:r>
-        <w:rPr>
-          <w:color w:val="215E99" w:themeColor="text2" w:themeTint="BF"/>
-          <w:lang w:val="en-US"/>
-        </w:rPr>
-        <w:t xml:space="preserve">         </w:t>
-      </w:r>
-      <w:r>
-        <w:rPr>
-          <w:color w:val="215E99" w:themeColor="text2" w:themeTint="BF"/>
-          <w:lang w:val="en-US"/>
-        </w:rPr>
-        <w:t>P – Put to other use</w:t>
-      </w:r>
-    </w:p>
-    <w:p>
-      <w:pPr>
-        <w:rPr>
-          <w:color w:val="000000" w:themeColor="text1"/>
-          <w:lang w:val="en-US"/>
-        </w:rPr>
-      </w:pPr>
-      <w:r>
-        <w:rPr>
-          <w:color w:val="000000" w:themeColor="text1"/>
-          <w:lang w:val="en-US"/>
-        </w:rPr>
-        <w:t>Use light not only to reveal paths but also to weaken enemies temporarily</w:t>
-      </w:r>
-    </w:p>
-    <w:p>
-      <w:pPr>
-        <w:rPr>
-          <w:color w:val="000000" w:themeColor="text1"/>
-        </w:rPr>
-      </w:pPr>
-      <w:r>
-        <w:rPr>
-          <w:color w:val="000000" w:themeColor="text1"/>
-          <w:lang w:val="en-US"/>
-        </w:rPr>
-        <w:t xml:space="preserve">          </w:t>
-      </w:r>
-      <w:r>
-        <w:rPr>
-          <w:color w:val="215E99" w:themeColor="text2" w:themeTint="BF"/>
-        </w:rPr>
-        <w:t xml:space="preserve">E – </w:t>
-      </w:r>
-      <w:proofErr w:type="spellStart"/>
-      <w:r>
-        <w:rPr>
-          <w:color w:val="215E99" w:themeColor="text2" w:themeTint="BF"/>
-        </w:rPr>
-        <w:t>Eliminate</w:t>
-      </w:r>
-      <w:proofErr w:type="spellEnd"/>
-      <w:r>
-        <w:rPr>
-          <w:color w:val="215E99" w:themeColor="text2" w:themeTint="BF"/>
-        </w:rPr>
-        <w:t> :</w:t>
-      </w:r>
-    </w:p>
-    <w:p>
-      <w:pPr>
-        <w:rPr>
-          <w:color w:val="000000" w:themeColor="text1"/>
-          <w:lang w:val="en-US"/>
-        </w:rPr>
-      </w:pPr>
-      <w:r>
-        <w:rPr>
-          <w:color w:val="000000" w:themeColor="text1"/>
-          <w:lang w:val="en-US"/>
-        </w:rPr>
-        <w:t>Eliminate UI completely to increase immersion and tension</w:t>
-      </w:r>
-    </w:p>
-    <w:p>
-      <w:pPr>
-        <w:rPr>
-          <w:color w:val="215E99" w:themeColor="text2" w:themeTint="BF"/>
-          <w:lang w:val="en-US"/>
-        </w:rPr>
-      </w:pPr>
-      <w:r>
-        <w:rPr>
-          <w:color w:val="215E99" w:themeColor="text2" w:themeTint="BF"/>
-          <w:lang w:val="en-US"/>
-        </w:rPr>
-        <w:t xml:space="preserve">           </w:t>
-      </w:r>
-      <w:r>
-        <w:rPr>
-          <w:color w:val="215E99" w:themeColor="text2" w:themeTint="BF"/>
-          <w:lang w:val="en-US"/>
-        </w:rPr>
-        <w:t>R – Reverse</w:t>
-      </w:r>
-      <w:r>
-        <w:rPr>
-          <w:color w:val="215E99" w:themeColor="text2" w:themeTint="BF"/>
-          <w:lang w:val="en-US"/>
-        </w:rPr>
-        <w:t>:</w:t>
-      </w:r>
-    </w:p>
-    <w:p>
-      <w:pPr>
-        <w:rPr>
-          <w:color w:val="000000" w:themeColor="text1"/>
-          <w:lang w:val="en-US"/>
-        </w:rPr>
-      </w:pPr>
-      <w:r>
-        <w:rPr>
-          <w:color w:val="000000" w:themeColor="text1"/>
-          <w:lang w:val="en-US"/>
-        </w:rPr>
-        <w:t>Instead of escaping monsters, the player must guide monsters away to unlock new paths.</w:t>
-      </w:r>
-    </w:p>
-    <w:p>
-      <w:pPr>
-        <w:rPr>
-          <w:color w:val="000000" w:themeColor="text1"/>
-          <w:lang w:val="en-US"/>
-        </w:rPr>
-      </w:pPr>
-    </w:p>
-    <w:p>
-      <w:pPr>
-        <w:rPr>
-          <w:b/>
-          <w:bCs/>
-          <w:color w:val="EE0000"/>
-        </w:rPr>
-      </w:pPr>
-      <w:proofErr w:type="gramStart"/>
-      <w:r>
-        <w:rPr>
-          <w:b/>
-          <w:bCs/>
-          <w:color w:val="EE0000"/>
-        </w:rPr>
-        <w:t>Exercice:</w:t>
-      </w:r>
-      <w:proofErr w:type="gramEnd"/>
-      <w:r>
-        <w:rPr>
-          <w:b/>
-          <w:bCs/>
-          <w:color w:val="EE0000"/>
-        </w:rPr>
-        <w:t xml:space="preserve"> About the Game</w:t>
-      </w:r>
-    </w:p>
-    <w:p>
-      <w:pPr>
-        <w:rPr>
-          <w:b/>
-          <w:bCs/>
-          <w:color w:val="215E99" w:themeColor="text2" w:themeTint="BF"/>
-        </w:rPr>
-      </w:pPr>
-      <w:proofErr w:type="spellStart"/>
-      <w:r>
-        <w:rPr>
-          <w:b/>
-          <w:bCs/>
-          <w:color w:val="215E99" w:themeColor="text2" w:themeTint="BF"/>
-        </w:rPr>
-        <w:lastRenderedPageBreak/>
-        <w:t>Idea</w:t>
-      </w:r>
-      <w:proofErr w:type="spellEnd"/>
-      <w:r>
-        <w:rPr>
-          <w:b/>
-          <w:bCs/>
-          <w:color w:val="215E99" w:themeColor="text2" w:themeTint="BF"/>
-        </w:rPr>
-        <w:t xml:space="preserve"> (Player → </w:t>
-      </w:r>
-      <w:proofErr w:type="spellStart"/>
-      <w:r>
-        <w:rPr>
-          <w:b/>
-          <w:bCs/>
-          <w:color w:val="215E99" w:themeColor="text2" w:themeTint="BF"/>
-        </w:rPr>
-        <w:t>Verb</w:t>
-      </w:r>
-      <w:proofErr w:type="spellEnd"/>
-      <w:r>
-        <w:rPr>
-          <w:b/>
-          <w:bCs/>
-          <w:color w:val="215E99" w:themeColor="text2" w:themeTint="BF"/>
-        </w:rPr>
-        <w:t xml:space="preserve"> → Goal)</w:t>
-      </w:r>
-      <w:r>
-        <w:rPr>
-          <w:b/>
-          <w:bCs/>
-          <w:color w:val="215E99" w:themeColor="text2" w:themeTint="BF"/>
-        </w:rPr>
-        <w:t> :</w:t>
-      </w:r>
-    </w:p>
-    <w:p>
-      <w:pPr>
-        <w:rPr>
-          <w:color w:val="000000" w:themeColor="text1"/>
-          <w:lang w:val="en-US"/>
-        </w:rPr>
-      </w:pPr>
-      <w:proofErr w:type="gramStart"/>
-      <w:r>
-        <w:rPr>
-          <w:b/>
-          <w:bCs/>
-          <w:color w:val="000000" w:themeColor="text1"/>
-          <w:lang w:val="en-US"/>
-        </w:rPr>
-        <w:t>Goal</w:t>
-      </w:r>
-      <w:r>
-        <w:rPr>
-          <w:color w:val="000000" w:themeColor="text1"/>
-          <w:lang w:val="en-US"/>
-        </w:rPr>
-        <w:t> :</w:t>
-      </w:r>
-      <w:proofErr w:type="gramEnd"/>
-      <w:r>
-        <w:rPr>
-          <w:color w:val="000000" w:themeColor="text1"/>
-          <w:lang w:val="en-US"/>
-        </w:rPr>
-        <w:t xml:space="preserve">   </w:t>
-      </w:r>
-      <w:r>
-        <w:rPr>
-          <w:color w:val="000000" w:themeColor="text1"/>
-          <w:lang w:val="en-US"/>
-        </w:rPr>
-        <w:t>Escape the level without getting caught</w:t>
-      </w:r>
-    </w:p>
-    <w:p>
-      <w:pPr>
-        <w:rPr>
-          <w:color w:val="000000" w:themeColor="text1"/>
-        </w:rPr>
-      </w:pPr>
-      <w:r>
-        <w:rPr>
-          <w:b/>
-          <w:bCs/>
-          <w:color w:val="000000" w:themeColor="text1"/>
-        </w:rPr>
-        <w:t>Rules</w:t>
-      </w:r>
-      <w:r>
-        <w:rPr>
-          <w:color w:val="000000" w:themeColor="text1"/>
-        </w:rPr>
-        <w:t> :</w:t>
-      </w:r>
-    </w:p>
-    <w:p>
-      <w:pPr>
-        <w:rPr>
-          <w:color w:val="000000" w:themeColor="text1"/>
-          <w:lang w:val="en-US"/>
-        </w:rPr>
-      </w:pPr>
-      <w:r>
-        <w:rPr>
-          <w:color w:val="000000" w:themeColor="text1"/>
-          <w:lang w:val="en-US"/>
-        </w:rPr>
-        <w:t>1.</w:t>
-      </w:r>
-      <w:r>
-        <w:rPr>
-          <w:color w:val="000000" w:themeColor="text1"/>
-          <w:lang w:val="en-US"/>
-        </w:rPr>
-        <w:t xml:space="preserve"> The player cannot fight enemies.</w:t>
-      </w:r>
-    </w:p>
-    <w:p>
-      <w:pPr>
-        <w:rPr>
-          <w:color w:val="000000" w:themeColor="text1"/>
-          <w:lang w:val="en-US"/>
-        </w:rPr>
-      </w:pPr>
-      <w:r>
-        <w:rPr>
-          <w:color w:val="000000" w:themeColor="text1"/>
-          <w:lang w:val="en-US"/>
-        </w:rPr>
-        <w:t xml:space="preserve">2. </w:t>
-      </w:r>
-      <w:r>
-        <w:rPr>
-          <w:color w:val="000000" w:themeColor="text1"/>
-          <w:lang w:val="en-US"/>
-        </w:rPr>
-        <w:t>The player must hide and move quietly.</w:t>
-      </w:r>
-    </w:p>
-    <w:p>
-      <w:pPr>
-        <w:rPr>
-          <w:color w:val="000000" w:themeColor="text1"/>
-        </w:rPr>
-      </w:pPr>
-      <w:r>
-        <w:rPr>
-          <w:b/>
-          <w:bCs/>
-          <w:color w:val="000000" w:themeColor="text1"/>
-        </w:rPr>
-        <w:t>Feedback</w:t>
-      </w:r>
-      <w:r>
-        <w:rPr>
-          <w:color w:val="000000" w:themeColor="text1"/>
-        </w:rPr>
-        <w:t> :</w:t>
-      </w:r>
-    </w:p>
-    <w:p>
-      <w:pPr>
-        <w:rPr>
-          <w:color w:val="000000" w:themeColor="text1"/>
-          <w:lang w:val="en-US"/>
-        </w:rPr>
-      </w:pPr>
-      <w:r>
-        <w:rPr>
-          <w:color w:val="000000" w:themeColor="text1"/>
-          <w:lang w:val="en-US"/>
-        </w:rPr>
-        <w:t>A scary sound plays when an enemy is close.</w:t>
-      </w:r>
-    </w:p>
-    <w:p>
-      <w:pPr>
-        <w:rPr>
-          <w:b/>
-          <w:bCs/>
-          <w:color w:val="215E99" w:themeColor="text2" w:themeTint="BF"/>
-        </w:rPr>
-      </w:pPr>
-      <w:r>
-        <w:rPr>
-          <w:b/>
-          <w:bCs/>
-          <w:color w:val="215E99" w:themeColor="text2" w:themeTint="BF"/>
-        </w:rPr>
-        <w:t xml:space="preserve">Rule Change &amp; </w:t>
-      </w:r>
-      <w:proofErr w:type="spellStart"/>
-      <w:r>
-        <w:rPr>
-          <w:b/>
-          <w:bCs/>
-          <w:color w:val="215E99" w:themeColor="text2" w:themeTint="BF"/>
-        </w:rPr>
-        <w:t>Effect</w:t>
-      </w:r>
-      <w:proofErr w:type="spellEnd"/>
-      <w:r>
-        <w:rPr>
-          <w:b/>
-          <w:bCs/>
-          <w:color w:val="215E99" w:themeColor="text2" w:themeTint="BF"/>
-        </w:rPr>
-        <w:t> :</w:t>
-      </w:r>
-    </w:p>
-    <w:p>
-      <w:pPr>
-        <w:rPr>
-          <w:color w:val="000000" w:themeColor="text1"/>
-          <w:lang w:val="en-US"/>
-        </w:rPr>
-      </w:pPr>
-      <w:r>
-        <w:rPr>
-          <w:color w:val="000000" w:themeColor="text1"/>
-          <w:lang w:val="en-US"/>
-        </w:rPr>
-        <w:t xml:space="preserve">If the player can fight </w:t>
-      </w:r>
-      <w:proofErr w:type="gramStart"/>
-      <w:r>
-        <w:rPr>
-          <w:color w:val="000000" w:themeColor="text1"/>
-          <w:lang w:val="en-US"/>
-        </w:rPr>
-        <w:t>enemies</w:t>
-      </w:r>
-      <w:r>
-        <w:rPr>
-          <w:color w:val="000000" w:themeColor="text1"/>
-          <w:lang w:val="en-US"/>
-        </w:rPr>
-        <w:t xml:space="preserve"> </w:t>
-      </w:r>
-      <w:r>
-        <w:rPr>
-          <w:color w:val="000000" w:themeColor="text1"/>
-          <w:lang w:val="en-US"/>
-        </w:rPr>
-        <w:t xml:space="preserve"> the</w:t>
-      </w:r>
-      <w:proofErr w:type="gramEnd"/>
-      <w:r>
-        <w:rPr>
-          <w:color w:val="000000" w:themeColor="text1"/>
-          <w:lang w:val="en-US"/>
-        </w:rPr>
-        <w:t xml:space="preserve"> game becomes less scary and more action-</w:t>
-      </w:r>
-      <w:proofErr w:type="gramStart"/>
-      <w:r>
-        <w:rPr>
-          <w:color w:val="000000" w:themeColor="text1"/>
-          <w:lang w:val="en-US"/>
-        </w:rPr>
-        <w:t>focused</w:t>
-      </w:r>
-      <w:r>
-        <w:rPr>
-          <w:color w:val="000000" w:themeColor="text1"/>
-          <w:lang w:val="en-US"/>
-        </w:rPr>
-        <w:t xml:space="preserve"> </w:t>
-      </w:r>
-      <w:r>
-        <w:rPr>
-          <w:color w:val="000000" w:themeColor="text1"/>
-          <w:lang w:val="en-US"/>
-        </w:rPr>
-        <w:t>.</w:t>
-      </w:r>
-      <w:proofErr w:type="gramEnd"/>
-    </w:p>
-    <w:p>
-      <w:pPr>
-        <w:rPr>
-          <w:b/>
-          <w:bCs/>
-          <w:color w:val="EE0000"/>
-        </w:rPr>
-      </w:pPr>
-      <w:r>
-        <w:rPr>
-          <w:b/>
-          <w:bCs/>
-          <w:color w:val="EE0000"/>
-        </w:rPr>
-        <w:t>Exercice : Pillars</w:t>
-      </w:r>
-    </w:p>
-    <w:p>
-      <w:pPr>
-        <w:rPr>
-          <w:color w:val="215E99" w:themeColor="text2" w:themeTint="BF"/>
-        </w:rPr>
-      </w:pPr>
-      <w:r>
-        <w:rPr>
-          <w:color w:val="215E99" w:themeColor="text2" w:themeTint="BF"/>
-        </w:rPr>
-        <w:t>1.</w:t>
-      </w:r>
-      <w:r>
-        <w:rPr>
-          <w:color w:val="215E99" w:themeColor="text2" w:themeTint="BF"/>
-        </w:rPr>
-        <w:t>Pillars (</w:t>
-      </w:r>
-      <w:proofErr w:type="spellStart"/>
-      <w:r>
-        <w:rPr>
-          <w:color w:val="215E99" w:themeColor="text2" w:themeTint="BF"/>
-        </w:rPr>
-        <w:t>Feel</w:t>
-      </w:r>
-      <w:proofErr w:type="spellEnd"/>
-      <w:r>
-        <w:rPr>
-          <w:color w:val="215E99" w:themeColor="text2" w:themeTint="BF"/>
-        </w:rPr>
-        <w:t xml:space="preserve"> Words)</w:t>
-      </w:r>
-      <w:r>
-        <w:rPr>
-          <w:color w:val="215E99" w:themeColor="text2" w:themeTint="BF"/>
-        </w:rPr>
-        <w:t> :</w:t>
+          <w:lang w:val="en-US"/>
+        </w:rPr>
+        <w:t>Pillars (Feel Words) :</w:t>
       </w:r>
     </w:p>
     <w:p>
@@ -1143,14 +806,12 @@
           <w:color w:val="000000" w:themeColor="text1"/>
         </w:rPr>
       </w:pPr>
-      <w:proofErr w:type="spellStart"/>
       <w:r>
         <w:rPr>
           <w:color w:val="000000" w:themeColor="text1"/>
         </w:rPr>
         <w:t>Sneaky</w:t>
       </w:r>
-      <w:proofErr w:type="spellEnd"/>
     </w:p>
     <w:p>
       <w:pPr>
@@ -1227,23 +888,13 @@
           <w:color w:val="EE0000"/>
         </w:rPr>
       </w:pPr>
-      <w:proofErr w:type="gramStart"/>
       <w:r>
         <w:rPr>
           <w:b/>
           <w:bCs/>
           <w:color w:val="EE0000"/>
         </w:rPr>
-        <w:t>Exercice:</w:t>
-      </w:r>
-      <w:proofErr w:type="gramEnd"/>
-      <w:r>
-        <w:rPr>
-          <w:b/>
-          <w:bCs/>
-          <w:color w:val="EE0000"/>
-        </w:rPr>
-        <w:t xml:space="preserve"> MDA</w:t>
+        <w:t>Exercice: MDA</w:t>
       </w:r>
     </w:p>
     <w:p>
@@ -1285,28 +936,12 @@
           <w:lang w:val="en-US"/>
         </w:rPr>
       </w:pPr>
-      <w:proofErr w:type="gramStart"/>
       <w:r>
         <w:rPr>
           <w:color w:val="4C94D8" w:themeColor="text2" w:themeTint="80"/>
           <w:lang w:val="en-US"/>
         </w:rPr>
-        <w:t>Hiding</w:t>
-      </w:r>
-      <w:r>
-        <w:rPr>
-          <w:color w:val="4C94D8" w:themeColor="text2" w:themeTint="80"/>
-          <w:lang w:val="en-US"/>
-        </w:rPr>
-        <w:t> :</w:t>
-      </w:r>
-      <w:proofErr w:type="gramEnd"/>
-      <w:r>
-        <w:rPr>
-          <w:color w:val="4C94D8" w:themeColor="text2" w:themeTint="80"/>
-          <w:lang w:val="en-US"/>
-        </w:rPr>
-        <w:t xml:space="preserve">  </w:t>
+        <w:t xml:space="preserve">Hiding :  </w:t>
       </w:r>
       <w:r>
         <w:rPr>
@@ -1325,7 +960,6 @@
           <w:lang w:val="en-US"/>
         </w:rPr>
       </w:pPr>
-      <w:proofErr w:type="gramStart"/>
       <w:r>
         <w:rPr>
           <w:color w:val="4C94D8" w:themeColor="text2" w:themeTint="80"/>
@@ -1340,67 +974,140 @@
           <w:color w:val="4C94D8" w:themeColor="text2" w:themeTint="80"/>
           <w:lang w:val="en-US"/>
         </w:rPr>
-        <w:t> :</w:t>
-      </w:r>
-      <w:proofErr w:type="gramEnd"/>
-      <w:r>
-        <w:rPr>
-          <w:b/>
-          <w:bCs/>
+        <w:t xml:space="preserve"> :  </w:t>
+      </w:r>
+      <w:r>
+        <w:rPr>
+          <w:color w:val="000000" w:themeColor="text1"/>
+          <w:lang w:val="en-US"/>
+        </w:rPr>
+        <w:t>Makes the player feel careful and nervous</w:t>
+      </w:r>
+    </w:p>
+    <w:p>
+      <w:pPr>
+        <w:jc w:val="both"/>
+        <w:rPr>
+          <w:color w:val="000000" w:themeColor="text1"/>
+          <w:lang w:val="en-US"/>
+        </w:rPr>
+      </w:pPr>
+      <w:r>
+        <w:rPr>
           <w:color w:val="4C94D8" w:themeColor="text2" w:themeTint="80"/>
           <w:lang w:val="en-US"/>
         </w:rPr>
-        <w:t xml:space="preserve">  </w:t>
-      </w:r>
-      <w:r>
-        <w:rPr>
-          <w:color w:val="000000" w:themeColor="text1"/>
-          <w:lang w:val="en-US"/>
-        </w:rPr>
-        <w:t>Makes the player feel careful and nervous</w:t>
+        <w:t xml:space="preserve">       </w:t>
+      </w:r>
+      <w:r>
+        <w:rPr>
+          <w:color w:val="4C94D8" w:themeColor="text2" w:themeTint="80"/>
+          <w:lang w:val="en-US"/>
+        </w:rPr>
+        <w:t xml:space="preserve">Solving puzzles : </w:t>
+      </w:r>
+      <w:r>
+        <w:rPr>
+          <w:color w:val="000000" w:themeColor="text1"/>
+          <w:lang w:val="en-US"/>
+        </w:rPr>
+        <w:t>Creates curiosity and focus.</w:t>
       </w:r>
     </w:p>
     <w:p>
       <w:pPr>
         <w:jc w:val="both"/>
         <w:rPr>
-          <w:color w:val="000000" w:themeColor="text1"/>
-          <w:lang w:val="en-US"/>
-        </w:rPr>
-      </w:pPr>
-      <w:r>
+          <w:color w:val="215E99" w:themeColor="text2" w:themeTint="BF"/>
+        </w:rPr>
+      </w:pPr>
+      <w:r>
+        <w:rPr>
+          <w:color w:val="215E99" w:themeColor="text2" w:themeTint="BF"/>
+        </w:rPr>
+        <w:t>2.</w:t>
+      </w:r>
+      <w:r>
+        <w:rPr>
+          <w:color w:val="215E99" w:themeColor="text2" w:themeTint="BF"/>
+        </w:rPr>
+        <w:t>Removing One Mechanic :</w:t>
+      </w:r>
+    </w:p>
+    <w:p>
+      <w:pPr>
+        <w:jc w:val="both"/>
+        <w:rPr>
+          <w:color w:val="000000" w:themeColor="text1"/>
+          <w:lang w:val="en-US"/>
+        </w:rPr>
+      </w:pPr>
+      <w:r>
+        <w:rPr>
+          <w:color w:val="000000" w:themeColor="text1"/>
+          <w:lang w:val="en-US"/>
+        </w:rPr>
+        <w:t>If hiding is removed, the game feels less scary and more easy and safe.</w:t>
+      </w:r>
+    </w:p>
+    <w:p>
+      <w:pPr>
+        <w:jc w:val="both"/>
+        <w:rPr>
+          <w:b/>
+          <w:bCs/>
+          <w:color w:val="EE0000"/>
+        </w:rPr>
+      </w:pPr>
+      <w:r>
+        <w:rPr>
+          <w:b/>
+          <w:bCs/>
+          <w:color w:val="EE0000"/>
+        </w:rPr>
+        <w:t>Exercice: Core Loop &amp; Progression</w:t>
+      </w:r>
+    </w:p>
+    <w:p>
+      <w:pPr>
+        <w:jc w:val="both"/>
         <w:rPr>
           <w:color w:val="4C94D8" w:themeColor="text2" w:themeTint="80"/>
-          <w:lang w:val="en-US"/>
-        </w:rPr>
-        <w:t xml:space="preserve">       </w:t>
-      </w:r>
+        </w:rPr>
+      </w:pPr>
       <w:r>
         <w:rPr>
           <w:color w:val="4C94D8" w:themeColor="text2" w:themeTint="80"/>
-          <w:lang w:val="en-US"/>
-        </w:rPr>
-        <w:t xml:space="preserve">Solving </w:t>
-      </w:r>
-      <w:proofErr w:type="gramStart"/>
+        </w:rPr>
+        <w:t>1</w:t>
+      </w:r>
       <w:r>
         <w:rPr>
           <w:color w:val="4C94D8" w:themeColor="text2" w:themeTint="80"/>
-          <w:lang w:val="en-US"/>
-        </w:rPr>
-        <w:t xml:space="preserve">puzzles </w:t>
-      </w:r>
-      <w:r>
-        <w:rPr>
-          <w:color w:val="4C94D8" w:themeColor="text2" w:themeTint="80"/>
-          <w:lang w:val="en-US"/>
-        </w:rPr>
-        <w:t>:</w:t>
-      </w:r>
-      <w:proofErr w:type="gramEnd"/>
-      <w:r>
-        <w:rPr>
-          <w:color w:val="4C94D8" w:themeColor="text2" w:themeTint="80"/>
+        </w:rPr>
+        <w:t>.Core Loop :</w:t>
+      </w:r>
+    </w:p>
+    <w:p>
+      <w:pPr>
+        <w:jc w:val="both"/>
+        <w:rPr>
+          <w:color w:val="000000" w:themeColor="text1"/>
+          <w:lang w:val="en-US"/>
+        </w:rPr>
+      </w:pPr>
+      <w:r>
+        <w:rPr>
+          <w:color w:val="000000" w:themeColor="text1"/>
+          <w:lang w:val="en-US"/>
+        </w:rPr>
+        <w:t>Do sneak</w:t>
+      </w:r>
+      <w:r>
+        <w:rPr>
+          <w:b/>
+          <w:bCs/>
+          <w:color w:val="000000" w:themeColor="text1"/>
           <w:lang w:val="en-US"/>
         </w:rPr>
         <w:t xml:space="preserve"> </w:t>
@@ -1410,141 +1117,7 @@
           <w:color w:val="000000" w:themeColor="text1"/>
           <w:lang w:val="en-US"/>
         </w:rPr>
-        <w:t>Creates curiosity and focus.</w:t>
-      </w:r>
-    </w:p>
-    <w:p>
-      <w:pPr>
-        <w:jc w:val="both"/>
-        <w:rPr>
-          <w:color w:val="215E99" w:themeColor="text2" w:themeTint="BF"/>
-        </w:rPr>
-      </w:pPr>
-      <w:r>
-        <w:rPr>
-          <w:color w:val="215E99" w:themeColor="text2" w:themeTint="BF"/>
-        </w:rPr>
-        <w:t>2.</w:t>
-      </w:r>
-      <w:r>
-        <w:rPr>
-          <w:color w:val="215E99" w:themeColor="text2" w:themeTint="BF"/>
-        </w:rPr>
-        <w:t>Removing One Mechanic</w:t>
-      </w:r>
-      <w:r>
-        <w:rPr>
-          <w:color w:val="215E99" w:themeColor="text2" w:themeTint="BF"/>
-        </w:rPr>
-        <w:t> :</w:t>
-      </w:r>
-    </w:p>
-    <w:p>
-      <w:pPr>
-        <w:jc w:val="both"/>
-        <w:rPr>
-          <w:color w:val="000000" w:themeColor="text1"/>
-          <w:lang w:val="en-US"/>
-        </w:rPr>
-      </w:pPr>
-      <w:r>
-        <w:rPr>
-          <w:color w:val="000000" w:themeColor="text1"/>
-          <w:lang w:val="en-US"/>
-        </w:rPr>
-        <w:t xml:space="preserve">If hiding is removed, the game feels less scary and </w:t>
-      </w:r>
-      <w:proofErr w:type="gramStart"/>
-      <w:r>
-        <w:rPr>
-          <w:color w:val="000000" w:themeColor="text1"/>
-          <w:lang w:val="en-US"/>
-        </w:rPr>
-        <w:t>more easy and safe</w:t>
-      </w:r>
-      <w:proofErr w:type="gramEnd"/>
-      <w:r>
-        <w:rPr>
-          <w:color w:val="000000" w:themeColor="text1"/>
-          <w:lang w:val="en-US"/>
-        </w:rPr>
-        <w:t>.</w:t>
-      </w:r>
-    </w:p>
-    <w:p>
-      <w:pPr>
-        <w:jc w:val="both"/>
-        <w:rPr>
-          <w:b/>
-          <w:bCs/>
-          <w:color w:val="EE0000"/>
-        </w:rPr>
-      </w:pPr>
-      <w:proofErr w:type="gramStart"/>
-      <w:r>
-        <w:rPr>
-          <w:b/>
-          <w:bCs/>
-          <w:color w:val="EE0000"/>
-        </w:rPr>
-        <w:t>Exercice:</w:t>
-      </w:r>
-      <w:proofErr w:type="gramEnd"/>
-      <w:r>
-        <w:rPr>
-          <w:b/>
-          <w:bCs/>
-          <w:color w:val="EE0000"/>
-        </w:rPr>
-        <w:t xml:space="preserve"> Core Loop &amp; Progression</w:t>
-      </w:r>
-    </w:p>
-    <w:p>
-      <w:pPr>
-        <w:jc w:val="both"/>
-        <w:rPr>
-          <w:color w:val="4C94D8" w:themeColor="text2" w:themeTint="80"/>
-        </w:rPr>
-      </w:pPr>
-      <w:r>
-        <w:rPr>
-          <w:color w:val="4C94D8" w:themeColor="text2" w:themeTint="80"/>
-        </w:rPr>
-        <w:t>1</w:t>
-      </w:r>
-      <w:r>
-        <w:rPr>
-          <w:color w:val="4C94D8" w:themeColor="text2" w:themeTint="80"/>
-        </w:rPr>
-        <w:t>.</w:t>
-      </w:r>
-      <w:r>
-        <w:rPr>
-          <w:color w:val="4C94D8" w:themeColor="text2" w:themeTint="80"/>
-        </w:rPr>
-        <w:t>Core Loop</w:t>
-      </w:r>
-      <w:r>
-        <w:rPr>
-          <w:color w:val="4C94D8" w:themeColor="text2" w:themeTint="80"/>
-        </w:rPr>
-        <w:t> :</w:t>
-      </w:r>
-    </w:p>
-    <w:p>
-      <w:pPr>
-        <w:jc w:val="both"/>
-        <w:rPr>
-          <w:color w:val="000000" w:themeColor="text1"/>
-          <w:lang w:val="en-US"/>
-        </w:rPr>
-      </w:pPr>
-      <w:r>
-        <w:rPr>
-          <w:color w:val="000000" w:themeColor="text1"/>
-          <w:lang w:val="en-US"/>
-        </w:rPr>
-        <w:t>Do sneak</w:t>
+        <w:t>and</w:t>
       </w:r>
       <w:r>
         <w:rPr>
@@ -1560,101 +1133,35 @@
           <w:color w:val="000000" w:themeColor="text1"/>
           <w:lang w:val="en-US"/>
         </w:rPr>
-        <w:t>and</w:t>
-      </w:r>
-      <w:r>
-        <w:rPr>
-          <w:b/>
-          <w:bCs/>
-          <w:color w:val="000000" w:themeColor="text1"/>
-          <w:lang w:val="en-US"/>
-        </w:rPr>
-        <w:t xml:space="preserve"> </w:t>
-      </w:r>
-      <w:r>
-        <w:rPr>
-          <w:color w:val="000000" w:themeColor="text1"/>
-          <w:lang w:val="en-US"/>
-        </w:rPr>
         <w:t xml:space="preserve">hide </w:t>
       </w:r>
-      <w:proofErr w:type="spellStart"/>
-      <w:r>
-        <w:rPr>
-          <w:color w:val="000000" w:themeColor="text1"/>
-          <w:lang w:val="en-US"/>
-        </w:rPr>
-        <w:t xml:space="preserve">and </w:t>
-      </w:r>
-      <w:proofErr w:type="gramStart"/>
-      <w:r>
-        <w:rPr>
-          <w:color w:val="000000" w:themeColor="text1"/>
-          <w:lang w:val="en-US"/>
-        </w:rPr>
-        <w:t>than</w:t>
-      </w:r>
-      <w:proofErr w:type="spellEnd"/>
-      <w:r>
-        <w:rPr>
-          <w:color w:val="000000" w:themeColor="text1"/>
-          <w:lang w:val="en-US"/>
-        </w:rPr>
-        <w:t xml:space="preserve"> </w:t>
-      </w:r>
-      <w:r>
-        <w:rPr>
-          <w:color w:val="000000" w:themeColor="text1"/>
-          <w:lang w:val="en-US"/>
-        </w:rPr>
-        <w:t xml:space="preserve"> Get</w:t>
-      </w:r>
-      <w:proofErr w:type="gramEnd"/>
-      <w:r>
-        <w:rPr>
-          <w:color w:val="000000" w:themeColor="text1"/>
-          <w:lang w:val="en-US"/>
-        </w:rPr>
-        <w:t xml:space="preserve"> safety </w:t>
-      </w:r>
-      <w:proofErr w:type="spellStart"/>
-      <w:r>
-        <w:rPr>
-          <w:color w:val="000000" w:themeColor="text1"/>
-          <w:lang w:val="en-US"/>
-        </w:rPr>
-        <w:t>and than</w:t>
-      </w:r>
-      <w:proofErr w:type="spellEnd"/>
-      <w:r>
-        <w:rPr>
-          <w:color w:val="000000" w:themeColor="text1"/>
-          <w:lang w:val="en-US"/>
-        </w:rPr>
-        <w:t xml:space="preserve"> </w:t>
-      </w:r>
-      <w:proofErr w:type="gramStart"/>
-      <w:r>
-        <w:rPr>
-          <w:color w:val="000000" w:themeColor="text1"/>
-          <w:lang w:val="en-US"/>
-        </w:rPr>
-        <w:t xml:space="preserve">get </w:t>
-      </w:r>
-      <w:r>
-        <w:rPr>
-          <w:color w:val="000000" w:themeColor="text1"/>
-          <w:lang w:val="en-US"/>
-        </w:rPr>
-        <w:t xml:space="preserve"> Unlock</w:t>
-      </w:r>
-      <w:proofErr w:type="gramEnd"/>
-      <w:r>
-        <w:rPr>
-          <w:color w:val="000000" w:themeColor="text1"/>
-          <w:lang w:val="en-US"/>
-        </w:rPr>
-        <w:t>/Prepare next</w:t>
+      <w:r>
+        <w:rPr>
+          <w:color w:val="000000" w:themeColor="text1"/>
+          <w:lang w:val="en-US"/>
+        </w:rPr>
+        <w:t xml:space="preserve">and than </w:t>
+      </w:r>
+      <w:r>
+        <w:rPr>
+          <w:color w:val="000000" w:themeColor="text1"/>
+          <w:lang w:val="en-US"/>
+        </w:rPr>
+        <w:t xml:space="preserve"> Get safety </w:t>
+      </w:r>
+      <w:r>
+        <w:rPr>
+          <w:color w:val="000000" w:themeColor="text1"/>
+          <w:lang w:val="en-US"/>
+        </w:rPr>
+        <w:t xml:space="preserve">and than get </w:t>
+      </w:r>
+      <w:r>
+        <w:rPr>
+          <w:color w:val="000000" w:themeColor="text1"/>
+          <w:lang w:val="en-US"/>
+        </w:rPr>
+        <w:t xml:space="preserve"> Unlock/Prepare next</w:t>
       </w:r>
       <w:r>
         <w:rPr>
@@ -1777,26 +1284,17 @@
           <w:color w:val="4C94D8" w:themeColor="text2" w:themeTint="80"/>
           <w:lang w:val="en-US"/>
         </w:rPr>
-        <w:t xml:space="preserve"> </w:t>
-      </w:r>
-      <w:proofErr w:type="gramStart"/>
-      <w:r>
-        <w:rPr>
+        <w:t xml:space="preserve"> Test</w:t>
+      </w:r>
+      <w:r>
+        <w:rPr>
+          <w:b/>
+          <w:bCs/>
           <w:color w:val="4C94D8" w:themeColor="text2" w:themeTint="80"/>
           <w:lang w:val="en-US"/>
         </w:rPr>
-        <w:t>Test</w:t>
-      </w:r>
-      <w:r>
-        <w:rPr>
-          <w:b/>
-          <w:bCs/>
-          <w:color w:val="4C94D8" w:themeColor="text2" w:themeTint="80"/>
-          <w:lang w:val="en-US"/>
-        </w:rPr>
         <w:t>:</w:t>
       </w:r>
-      <w:proofErr w:type="gramEnd"/>
       <w:r>
         <w:rPr>
           <w:color w:val="4C94D8" w:themeColor="text2" w:themeTint="80"/>
@@ -1842,26 +1340,17 @@
           <w:color w:val="4C94D8" w:themeColor="text2" w:themeTint="80"/>
           <w:lang w:val="en-US"/>
         </w:rPr>
-        <w:t xml:space="preserve"> </w:t>
-      </w:r>
-      <w:proofErr w:type="gramStart"/>
-      <w:r>
-        <w:rPr>
+        <w:t xml:space="preserve"> Twist</w:t>
+      </w:r>
+      <w:r>
+        <w:rPr>
+          <w:b/>
+          <w:bCs/>
           <w:color w:val="4C94D8" w:themeColor="text2" w:themeTint="80"/>
           <w:lang w:val="en-US"/>
         </w:rPr>
-        <w:t>Twist</w:t>
-      </w:r>
-      <w:r>
-        <w:rPr>
-          <w:b/>
-          <w:bCs/>
-          <w:color w:val="4C94D8" w:themeColor="text2" w:themeTint="80"/>
-          <w:lang w:val="en-US"/>
-        </w:rPr>
         <w:t>:</w:t>
       </w:r>
-      <w:proofErr w:type="gramEnd"/>
       <w:r>
         <w:rPr>
           <w:color w:val="4C94D8" w:themeColor="text2" w:themeTint="80"/>
@@ -1907,26 +1396,17 @@
           <w:color w:val="4C94D8" w:themeColor="text2" w:themeTint="80"/>
           <w:lang w:val="en-US"/>
         </w:rPr>
-        <w:t xml:space="preserve"> </w:t>
-      </w:r>
-      <w:proofErr w:type="gramStart"/>
-      <w:r>
-        <w:rPr>
+        <w:t xml:space="preserve"> Master</w:t>
+      </w:r>
+      <w:r>
+        <w:rPr>
+          <w:b/>
+          <w:bCs/>
           <w:color w:val="4C94D8" w:themeColor="text2" w:themeTint="80"/>
           <w:lang w:val="en-US"/>
         </w:rPr>
-        <w:t>Master</w:t>
-      </w:r>
-      <w:r>
-        <w:rPr>
-          <w:b/>
-          <w:bCs/>
-          <w:color w:val="4C94D8" w:themeColor="text2" w:themeTint="80"/>
-          <w:lang w:val="en-US"/>
-        </w:rPr>
         <w:t>:</w:t>
       </w:r>
-      <w:proofErr w:type="gramEnd"/>
       <w:r>
         <w:rPr>
           <w:color w:val="4C94D8" w:themeColor="text2" w:themeTint="80"/>
@@ -1950,36 +1430,18 @@
           <w:b/>
           <w:bCs/>
           <w:color w:val="EE0000"/>
-        </w:rPr>
-      </w:pPr>
-      <w:proofErr w:type="gramStart"/>
+          <w:lang w:val="en-US"/>
+        </w:rPr>
+      </w:pPr>
       <w:r>
         <w:rPr>
           <w:b/>
           <w:bCs/>
           <w:color w:val="EE0000"/>
-        </w:rPr>
-        <w:t>Exercice:</w:t>
-      </w:r>
-      <w:proofErr w:type="gramEnd"/>
-      <w:r>
-        <w:rPr>
-          <w:b/>
-          <w:bCs/>
-          <w:color w:val="EE0000"/>
-        </w:rPr>
-        <w:t xml:space="preserve"> Goals, Rules, Feedback, </w:t>
-      </w:r>
-      <w:proofErr w:type="spellStart"/>
-      <w:r>
-        <w:rPr>
-          <w:b/>
-          <w:bCs/>
-          <w:color w:val="EE0000"/>
-        </w:rPr>
-        <w:t>Rewards</w:t>
-      </w:r>
-      <w:proofErr w:type="spellEnd"/>
+          <w:lang w:val="en-US"/>
+        </w:rPr>
+        <w:t>Exercice: Goals, Rules, Feedback, Rewards</w:t>
+      </w:r>
     </w:p>
     <w:p>
       <w:pPr>
@@ -2018,36 +1480,7 @@
           <w:color w:val="153D63" w:themeColor="text2" w:themeTint="E6"/>
           <w:lang w:val="en-US"/>
         </w:rPr>
-        <w:t xml:space="preserve">  </w:t>
-      </w:r>
-      <w:proofErr w:type="gramStart"/>
-      <w:r>
-        <w:rPr>
-          <w:b/>
-          <w:bCs/>
-          <w:color w:val="153D63" w:themeColor="text2" w:themeTint="E6"/>
-          <w:lang w:val="en-US"/>
-        </w:rPr>
-        <w:t>Goal</w:t>
-      </w:r>
-      <w:r>
-        <w:rPr>
-          <w:b/>
-          <w:bCs/>
-          <w:color w:val="153D63" w:themeColor="text2" w:themeTint="E6"/>
-          <w:lang w:val="en-US"/>
-        </w:rPr>
-        <w:t> :</w:t>
-      </w:r>
-      <w:proofErr w:type="gramEnd"/>
-      <w:r>
-        <w:rPr>
-          <w:b/>
-          <w:bCs/>
-          <w:color w:val="153D63" w:themeColor="text2" w:themeTint="E6"/>
-          <w:lang w:val="en-US"/>
-        </w:rPr>
-        <w:t xml:space="preserve">   </w:t>
+        <w:t xml:space="preserve">  Goal :   </w:t>
       </w:r>
       <w:r>
         <w:rPr>
@@ -2075,7 +1508,6 @@
         </w:rPr>
         <w:t xml:space="preserve">  </w:t>
       </w:r>
-      <w:proofErr w:type="gramStart"/>
       <w:r>
         <w:rPr>
           <w:b/>
@@ -2083,40 +1515,14 @@
           <w:color w:val="153D63" w:themeColor="text2" w:themeTint="E6"/>
           <w:lang w:val="en-US"/>
         </w:rPr>
-        <w:t>Rules</w:t>
-      </w:r>
-      <w:r>
-        <w:rPr>
-          <w:b/>
-          <w:bCs/>
-          <w:color w:val="153D63" w:themeColor="text2" w:themeTint="E6"/>
-          <w:lang w:val="en-US"/>
-        </w:rPr>
-        <w:t> :</w:t>
-      </w:r>
-      <w:proofErr w:type="gramEnd"/>
-      <w:r>
-        <w:rPr>
-          <w:b/>
-          <w:bCs/>
-          <w:color w:val="153D63" w:themeColor="text2" w:themeTint="E6"/>
-          <w:lang w:val="en-US"/>
-        </w:rPr>
-        <w:t xml:space="preserve">  </w:t>
+        <w:t xml:space="preserve">Rules :  </w:t>
       </w:r>
       <w:r>
         <w:rPr>
           <w:color w:val="0D0D0D" w:themeColor="text1" w:themeTint="F2"/>
           <w:lang w:val="en-US"/>
         </w:rPr>
-        <w:t>The player cannot fight enemies.</w:t>
-      </w:r>
-      <w:r>
-        <w:rPr>
-          <w:color w:val="0D0D0D" w:themeColor="text1" w:themeTint="F2"/>
-          <w:lang w:val="en-US"/>
-        </w:rPr>
-        <w:t xml:space="preserve"> </w:t>
+        <w:t xml:space="preserve">The player cannot fight enemies. </w:t>
       </w:r>
     </w:p>
     <w:p>
@@ -2127,6 +1533,7 @@
           <w:color w:val="0D0D0D" w:themeColor="text1" w:themeTint="F2"/>
           <w:sz w:val="22"/>
           <w:szCs w:val="22"/>
+          <w:lang w:val="en-US"/>
         </w:rPr>
       </w:pPr>
       <w:r>
@@ -2140,16 +1547,15 @@
         </w:rPr>
         <w:t xml:space="preserve">                    </w:t>
       </w:r>
-      <w:proofErr w:type="spellStart"/>
       <w:r>
         <w:rPr>
           <w:color w:val="0D0D0D" w:themeColor="text1" w:themeTint="F2"/>
           <w:sz w:val="22"/>
           <w:szCs w:val="22"/>
+          <w:lang w:val="en-US"/>
         </w:rPr>
         <w:t>Making</w:t>
       </w:r>
-      <w:proofErr w:type="spellEnd"/>
       <w:r>
         <w:rPr>
           <w:b/>
@@ -2157,6 +1563,7 @@
           <w:color w:val="0D0D0D" w:themeColor="text1" w:themeTint="F2"/>
           <w:sz w:val="22"/>
           <w:szCs w:val="22"/>
+          <w:lang w:val="en-US"/>
         </w:rPr>
         <w:t xml:space="preserve"> </w:t>
       </w:r>
@@ -2165,6 +1572,7 @@
           <w:color w:val="0D0D0D" w:themeColor="text1" w:themeTint="F2"/>
           <w:sz w:val="22"/>
           <w:szCs w:val="22"/>
+          <w:lang w:val="en-US"/>
         </w:rPr>
         <w:t>noise</w:t>
       </w:r>
@@ -2175,19 +1583,19 @@
           <w:color w:val="0D0D0D" w:themeColor="text1" w:themeTint="F2"/>
           <w:sz w:val="22"/>
           <w:szCs w:val="22"/>
+          <w:lang w:val="en-US"/>
         </w:rPr>
         <w:t xml:space="preserve"> </w:t>
       </w:r>
-      <w:proofErr w:type="spellStart"/>
       <w:r>
         <w:rPr>
           <w:color w:val="0D0D0D" w:themeColor="text1" w:themeTint="F2"/>
           <w:sz w:val="22"/>
           <w:szCs w:val="22"/>
+          <w:lang w:val="en-US"/>
         </w:rPr>
         <w:t>attracts</w:t>
       </w:r>
-      <w:proofErr w:type="spellEnd"/>
       <w:r>
         <w:rPr>
           <w:b/>
@@ -2195,26 +1603,18 @@
           <w:color w:val="0D0D0D" w:themeColor="text1" w:themeTint="F2"/>
           <w:sz w:val="22"/>
           <w:szCs w:val="22"/>
+          <w:lang w:val="en-US"/>
         </w:rPr>
         <w:t xml:space="preserve"> </w:t>
       </w:r>
-      <w:proofErr w:type="spellStart"/>
       <w:r>
         <w:rPr>
           <w:color w:val="0D0D0D" w:themeColor="text1" w:themeTint="F2"/>
           <w:sz w:val="22"/>
           <w:szCs w:val="22"/>
-        </w:rPr>
-        <w:t>enemies</w:t>
-      </w:r>
-      <w:proofErr w:type="spellEnd"/>
-      <w:r>
-        <w:rPr>
-          <w:color w:val="0D0D0D" w:themeColor="text1" w:themeTint="F2"/>
-          <w:sz w:val="22"/>
-          <w:szCs w:val="22"/>
-        </w:rPr>
-        <w:t>.</w:t>
+          <w:lang w:val="en-US"/>
+        </w:rPr>
+        <w:t>enemies.</w:t>
       </w:r>
     </w:p>
     <w:p>
@@ -2227,6 +1627,7 @@
           <w:color w:val="153D63" w:themeColor="text2" w:themeTint="E6"/>
           <w:sz w:val="22"/>
           <w:szCs w:val="22"/>
+          <w:lang w:val="en-US"/>
         </w:rPr>
       </w:pPr>
       <w:r>
@@ -2236,18 +1637,9 @@
           <w:color w:val="153D63" w:themeColor="text2" w:themeTint="E6"/>
           <w:sz w:val="22"/>
           <w:szCs w:val="22"/>
-        </w:rPr>
-        <w:t>Feedbacks</w:t>
-      </w:r>
-      <w:r>
-        <w:rPr>
-          <w:b/>
-          <w:bCs/>
-          <w:color w:val="153D63" w:themeColor="text2" w:themeTint="E6"/>
-          <w:sz w:val="22"/>
-          <w:szCs w:val="22"/>
-        </w:rPr>
-        <w:t xml:space="preserve"> :  </w:t>
+          <w:lang w:val="en-US"/>
+        </w:rPr>
+        <w:t xml:space="preserve">Feedbacks :  </w:t>
       </w:r>
     </w:p>
     <w:p>
@@ -2278,7 +1670,6 @@
         </w:rPr>
         <w:t xml:space="preserve"> </w:t>
       </w:r>
-      <w:proofErr w:type="gramStart"/>
       <w:r>
         <w:rPr>
           <w:b/>
@@ -2300,7 +1691,6 @@
         </w:rPr>
         <w:t xml:space="preserve">  Success</w:t>
       </w:r>
-      <w:proofErr w:type="gramEnd"/>
       <w:r>
         <w:rPr>
           <w:color w:val="0D0D0D" w:themeColor="text1" w:themeTint="F2"/>
@@ -2326,7 +1716,6 @@
           <w:lang w:val="en-US"/>
         </w:rPr>
       </w:pPr>
-      <w:proofErr w:type="gramStart"/>
       <w:r>
         <w:rPr>
           <w:b/>
@@ -2346,19 +1735,7 @@
           <w:szCs w:val="22"/>
           <w:lang w:val="en-US"/>
         </w:rPr>
-        <w:t xml:space="preserve">  Failure</w:t>
-      </w:r>
-      <w:proofErr w:type="gramEnd"/>
-      <w:r>
-        <w:rPr>
-          <w:b/>
-          <w:bCs/>
-          <w:color w:val="153D63" w:themeColor="text2" w:themeTint="E6"/>
-          <w:sz w:val="22"/>
-          <w:szCs w:val="22"/>
-          <w:lang w:val="en-US"/>
-        </w:rPr>
-        <w:t xml:space="preserve">: </w:t>
+        <w:t xml:space="preserve">  Failure: </w:t>
       </w:r>
       <w:r>
         <w:rPr>
@@ -2401,9 +1778,9 @@
           <w:color w:val="153D63" w:themeColor="text2" w:themeTint="E6"/>
           <w:sz w:val="22"/>
           <w:szCs w:val="22"/>
-        </w:rPr>
-      </w:pPr>
-      <w:proofErr w:type="spellStart"/>
+          <w:lang w:val="en-US"/>
+        </w:rPr>
+      </w:pPr>
       <w:r>
         <w:rPr>
           <w:b/>
@@ -2411,41 +1788,9 @@
           <w:color w:val="153D63" w:themeColor="text2" w:themeTint="E6"/>
           <w:sz w:val="22"/>
           <w:szCs w:val="22"/>
-        </w:rPr>
-        <w:t>Cosmetic</w:t>
-      </w:r>
-      <w:proofErr w:type="spellEnd"/>
-      <w:r>
-        <w:rPr>
-          <w:b/>
-          <w:bCs/>
-          <w:color w:val="153D63" w:themeColor="text2" w:themeTint="E6"/>
-          <w:sz w:val="22"/>
-          <w:szCs w:val="22"/>
-        </w:rPr>
-        <w:t xml:space="preserve"> </w:t>
-      </w:r>
-      <w:proofErr w:type="spellStart"/>
-      <w:r>
-        <w:rPr>
-          <w:b/>
-          <w:bCs/>
-          <w:color w:val="153D63" w:themeColor="text2" w:themeTint="E6"/>
-          <w:sz w:val="22"/>
-          <w:szCs w:val="22"/>
-        </w:rPr>
-        <w:t>Reward</w:t>
-      </w:r>
-      <w:proofErr w:type="spellEnd"/>
-      <w:r>
-        <w:rPr>
-          <w:b/>
-          <w:bCs/>
-          <w:color w:val="153D63" w:themeColor="text2" w:themeTint="E6"/>
-          <w:sz w:val="22"/>
-          <w:szCs w:val="22"/>
-        </w:rPr>
-        <w:t> :</w:t>
+          <w:lang w:val="en-US"/>
+        </w:rPr>
+        <w:t>Cosmetic Reward :</w:t>
       </w:r>
     </w:p>
     <w:p>
@@ -2481,7 +1826,6 @@
           <w:szCs w:val="22"/>
         </w:rPr>
       </w:pPr>
-      <w:proofErr w:type="gramStart"/>
       <w:r>
         <w:rPr>
           <w:b/>
@@ -2490,18 +1834,7 @@
           <w:sz w:val="22"/>
           <w:szCs w:val="22"/>
         </w:rPr>
-        <w:t>Exercice:</w:t>
-      </w:r>
-      <w:proofErr w:type="gramEnd"/>
-      <w:r>
-        <w:rPr>
-          <w:b/>
-          <w:bCs/>
-          <w:color w:val="EE0000"/>
-          <w:sz w:val="22"/>
-          <w:szCs w:val="22"/>
-        </w:rPr>
-        <w:t xml:space="preserve"> Fair Challenge &amp; Balance</w:t>
+        <w:t>Exercice: Fair Challenge &amp; Balance</w:t>
       </w:r>
     </w:p>
     <w:p>
@@ -2524,7 +1857,6 @@
           <w14:ligatures w14:val="none"/>
         </w:rPr>
       </w:pPr>
-      <w:proofErr w:type="spellStart"/>
       <w:r>
         <w:rPr>
           <w:rFonts w:ascii="Times New Roman" w:eastAsia="Times New Roman" w:hAnsi="Times New Roman" w:cs="Times New Roman"/>
@@ -2536,21 +1868,7 @@
           <w:lang w:eastAsia="fr-FR"/>
           <w14:ligatures w14:val="none"/>
         </w:rPr>
-        <w:t>Fairness</w:t>
-      </w:r>
-      <w:proofErr w:type="spellEnd"/>
-      <w:r>
-        <w:rPr>
-          <w:rFonts w:ascii="Times New Roman" w:eastAsia="Times New Roman" w:hAnsi="Times New Roman" w:cs="Times New Roman"/>
-          <w:b/>
-          <w:bCs/>
-          <w:kern w:val="0"/>
-          <w:sz w:val="27"/>
-          <w:szCs w:val="27"/>
-          <w:lang w:eastAsia="fr-FR"/>
-          <w14:ligatures w14:val="none"/>
-        </w:rPr>
-        <w:t xml:space="preserve"> Tool</w:t>
+        <w:t>Fairness Tool</w:t>
       </w:r>
     </w:p>
     <w:p>
@@ -2607,27 +1925,35 @@
           <w:szCs w:val="22"/>
         </w:rPr>
       </w:pPr>
-      <w:proofErr w:type="spellStart"/>
-      <w:r>
-        <w:rPr>
-          <w:b/>
-          <w:bCs/>
-          <w:color w:val="000000" w:themeColor="text1"/>
-          <w:sz w:val="22"/>
-          <w:szCs w:val="22"/>
-        </w:rPr>
-        <w:t>Knobs</w:t>
-      </w:r>
-      <w:proofErr w:type="spellEnd"/>
-      <w:r>
-        <w:rPr>
-          <w:b/>
-          <w:bCs/>
-          <w:color w:val="000000" w:themeColor="text1"/>
-          <w:sz w:val="22"/>
-          <w:szCs w:val="22"/>
-        </w:rPr>
-        <w:t xml:space="preserve"> to Tune</w:t>
+      <w:r>
+        <w:rPr>
+          <w:b/>
+          <w:bCs/>
+          <w:color w:val="000000" w:themeColor="text1"/>
+          <w:sz w:val="22"/>
+          <w:szCs w:val="22"/>
+        </w:rPr>
+        <w:t>2.</w:t>
+      </w:r>
+      <w:r>
+        <w:rPr>
+          <w:b/>
+          <w:bCs/>
+          <w:color w:val="000000" w:themeColor="text1"/>
+          <w:sz w:val="22"/>
+          <w:szCs w:val="22"/>
+        </w:rPr>
+        <w:t>Knobs to Tune</w:t>
+      </w:r>
+      <w:r>
+        <w:rPr>
+          <w:b/>
+          <w:bCs/>
+          <w:color w:val="000000" w:themeColor="text1"/>
+          <w:sz w:val="22"/>
+          <w:szCs w:val="22"/>
+        </w:rPr>
+        <w:t xml:space="preserve"> : </w:t>
       </w:r>
     </w:p>
     <w:p>
@@ -2641,8 +1967,64 @@
           <w:color w:val="000000" w:themeColor="text1"/>
           <w:sz w:val="22"/>
           <w:szCs w:val="22"/>
-        </w:rPr>
-      </w:pPr>
+          <w:lang w:val="en-US"/>
+        </w:rPr>
+      </w:pPr>
+      <w:r>
+        <w:rPr>
+          <w:b/>
+          <w:bCs/>
+          <w:color w:val="000000" w:themeColor="text1"/>
+          <w:sz w:val="22"/>
+          <w:szCs w:val="22"/>
+          <w:lang w:val="en-US"/>
+        </w:rPr>
+        <w:t>Enemy speed:</w:t>
+      </w:r>
+      <w:r>
+        <w:rPr>
+          <w:color w:val="000000" w:themeColor="text1"/>
+          <w:sz w:val="22"/>
+          <w:szCs w:val="22"/>
+          <w:lang w:val="en-US"/>
+        </w:rPr>
+        <w:t xml:space="preserve"> Slower enemies make the game less frustrating</w:t>
+      </w:r>
+    </w:p>
+    <w:p>
+      <w:pPr>
+        <w:numPr>
+          <w:ilvl w:val="0"/>
+          <w:numId w:val="16"/>
+        </w:numPr>
+        <w:jc w:val="both"/>
+        <w:rPr>
+          <w:color w:val="000000" w:themeColor="text1"/>
+          <w:sz w:val="22"/>
+          <w:szCs w:val="22"/>
+          <w:lang w:val="en-US"/>
+        </w:rPr>
+      </w:pPr>
+      <w:r>
+        <w:rPr>
+          <w:b/>
+          <w:bCs/>
+          <w:color w:val="000000" w:themeColor="text1"/>
+          <w:sz w:val="22"/>
+          <w:szCs w:val="22"/>
+          <w:lang w:val="en-US"/>
+        </w:rPr>
+        <w:t>Detection range:</w:t>
+      </w:r>
+      <w:r>
+        <w:rPr>
+          <w:color w:val="000000" w:themeColor="text1"/>
+          <w:sz w:val="22"/>
+          <w:szCs w:val="22"/>
+          <w:lang w:val="en-US"/>
+        </w:rPr>
+        <w:t xml:space="preserve"> Smaller range makes sneaking easier</w:t>
+      </w:r>
     </w:p>
     <w:p>
       <w:pPr>
@@ -2663,38 +2045,132 @@
         <w:rPr>
           <w:b/>
           <w:bCs/>
-          <w:color w:val="153D63" w:themeColor="text2" w:themeTint="E6"/>
-          <w:sz w:val="22"/>
-          <w:szCs w:val="22"/>
-          <w:lang w:val="en-US"/>
-        </w:rPr>
-      </w:pPr>
+          <w:color w:val="EE0000"/>
+          <w:sz w:val="22"/>
+          <w:szCs w:val="22"/>
+          <w:lang w:val="en-US"/>
+        </w:rPr>
+      </w:pPr>
+      <w:r>
+        <w:rPr>
+          <w:b/>
+          <w:bCs/>
+          <w:color w:val="EE0000"/>
+          <w:sz w:val="22"/>
+          <w:szCs w:val="22"/>
+          <w:lang w:val="en-US"/>
+        </w:rPr>
+        <w:t>Exercice : Level Design (Teach → Test → Twist → Master)</w:t>
+      </w:r>
     </w:p>
     <w:p>
       <w:pPr>
         <w:ind w:left="360"/>
         <w:jc w:val="both"/>
         <w:rPr>
-          <w:color w:val="0D0D0D" w:themeColor="text1" w:themeTint="F2"/>
-          <w:sz w:val="22"/>
-          <w:szCs w:val="22"/>
-          <w:lang w:val="en-US"/>
-        </w:rPr>
-      </w:pPr>
+          <w:b/>
+          <w:bCs/>
+          <w:color w:val="153D63" w:themeColor="text2" w:themeTint="E6"/>
+          <w:sz w:val="22"/>
+          <w:szCs w:val="22"/>
+        </w:rPr>
+      </w:pPr>
+      <w:r>
+        <w:rPr>
+          <w:b/>
+          <w:bCs/>
+          <w:color w:val="153D63" w:themeColor="text2" w:themeTint="E6"/>
+          <w:sz w:val="22"/>
+          <w:szCs w:val="22"/>
+        </w:rPr>
+        <w:t>Room 1 – Introduction Room</w:t>
+      </w:r>
     </w:p>
     <w:p>
       <w:pPr>
         <w:ind w:left="360"/>
         <w:jc w:val="both"/>
         <w:rPr>
-          <w:b/>
-          <w:bCs/>
-          <w:color w:val="153D63" w:themeColor="text2" w:themeTint="E6"/>
-          <w:sz w:val="22"/>
-          <w:szCs w:val="22"/>
-          <w:lang w:val="en-US"/>
-        </w:rPr>
-      </w:pPr>
+          <w:color w:val="0D0D0D" w:themeColor="text1" w:themeTint="F2"/>
+          <w:sz w:val="22"/>
+          <w:szCs w:val="22"/>
+          <w:lang w:val="en-US"/>
+        </w:rPr>
+      </w:pPr>
+      <w:r>
+        <w:rPr>
+          <w:color w:val="0D0D0D" w:themeColor="text1" w:themeTint="F2"/>
+          <w:sz w:val="22"/>
+          <w:szCs w:val="22"/>
+          <w:lang w:val="en-US"/>
+        </w:rPr>
+        <w:t>The player walks through a dark hallway and learns to use shadows</w:t>
+      </w:r>
+      <w:r>
+        <w:rPr>
+          <w:color w:val="0D0D0D" w:themeColor="text1" w:themeTint="F2"/>
+          <w:sz w:val="22"/>
+          <w:szCs w:val="22"/>
+          <w:lang w:val="en-US"/>
+        </w:rPr>
+        <w:t xml:space="preserve">, the </w:t>
+      </w:r>
+      <w:r>
+        <w:rPr>
+          <w:b/>
+          <w:bCs/>
+          <w:color w:val="0D0D0D" w:themeColor="text1" w:themeTint="F2"/>
+          <w:sz w:val="22"/>
+          <w:szCs w:val="22"/>
+          <w:lang w:val="en-US"/>
+        </w:rPr>
+        <w:t>checkpoint :</w:t>
+      </w:r>
+      <w:r>
+        <w:rPr>
+          <w:color w:val="0D0D0D" w:themeColor="text1" w:themeTint="F2"/>
+          <w:sz w:val="22"/>
+          <w:szCs w:val="22"/>
+          <w:lang w:val="en-US"/>
+        </w:rPr>
+        <w:t xml:space="preserve"> </w:t>
+      </w:r>
+      <w:r>
+        <w:rPr>
+          <w:color w:val="0D0D0D" w:themeColor="text1" w:themeTint="F2"/>
+          <w:sz w:val="22"/>
+          <w:szCs w:val="22"/>
+          <w:lang w:val="en-US"/>
+        </w:rPr>
+        <w:t xml:space="preserve">in the hallway it will </w:t>
+      </w:r>
+      <w:r>
+        <w:rPr>
+          <w:color w:val="0D0D0D" w:themeColor="text1" w:themeTint="F2"/>
+          <w:sz w:val="22"/>
+          <w:szCs w:val="22"/>
+          <w:lang w:val="en-US"/>
+        </w:rPr>
+        <w:t xml:space="preserve"> saves time </w:t>
+      </w:r>
+      <w:r>
+        <w:rPr>
+          <w:color w:val="0D0D0D" w:themeColor="text1" w:themeTint="F2"/>
+          <w:sz w:val="22"/>
+          <w:szCs w:val="22"/>
+          <w:lang w:val="en-US"/>
+        </w:rPr>
+        <w:t xml:space="preserve">for beginner to learn the control </w:t>
+      </w:r>
+      <w:r>
+        <w:rPr>
+          <w:color w:val="0D0D0D" w:themeColor="text1" w:themeTint="F2"/>
+          <w:sz w:val="22"/>
+          <w:szCs w:val="22"/>
+          <w:lang w:val="en-US"/>
+        </w:rPr>
+        <w:t>before danger starts</w:t>
+      </w:r>
     </w:p>
     <w:p>
       <w:pPr>
@@ -2703,10 +2179,33 @@
         <w:rPr>
           <w:b/>
           <w:bCs/>
-          <w:color w:val="153D63" w:themeColor="text2" w:themeTint="E6"/>
-          <w:lang w:val="en-US"/>
-        </w:rPr>
-      </w:pPr>
+          <w:color w:val="215E99" w:themeColor="text2" w:themeTint="BF"/>
+          <w:sz w:val="22"/>
+          <w:szCs w:val="22"/>
+          <w:lang w:val="en-US"/>
+        </w:rPr>
+      </w:pPr>
+      <w:r>
+        <w:rPr>
+          <w:b/>
+          <w:bCs/>
+          <w:color w:val="215E99" w:themeColor="text2" w:themeTint="BF"/>
+          <w:sz w:val="22"/>
+          <w:szCs w:val="22"/>
+        </w:rPr>
+        <w:t>Room 2 – Enemy Room</w:t>
+      </w:r>
+      <w:r>
+        <w:rPr>
+          <w:b/>
+          <w:bCs/>
+          <w:color w:val="215E99" w:themeColor="text2" w:themeTint="BF"/>
+          <w:sz w:val="22"/>
+          <w:szCs w:val="22"/>
+          <w:lang w:val="en-US"/>
+        </w:rPr>
+        <w:t xml:space="preserve"> </w:t>
+      </w:r>
     </w:p>
     <w:p>
       <w:pPr>
@@ -2716,9 +2215,76 @@
           <w:b/>
           <w:bCs/>
           <w:color w:val="153D63" w:themeColor="text2" w:themeTint="E6"/>
-          <w:lang w:val="en-US"/>
-        </w:rPr>
-      </w:pPr>
+          <w:sz w:val="22"/>
+          <w:szCs w:val="22"/>
+          <w:lang w:val="en-US"/>
+        </w:rPr>
+      </w:pPr>
+      <w:r>
+        <w:rPr>
+          <w:color w:val="0D0D0D" w:themeColor="text1" w:themeTint="F2"/>
+          <w:sz w:val="22"/>
+          <w:szCs w:val="22"/>
+          <w:lang w:val="en-US"/>
+        </w:rPr>
+        <w:t>The player must move between broken lamps to avoid being seen</w:t>
+      </w:r>
+      <w:r>
+        <w:rPr>
+          <w:color w:val="0D0D0D" w:themeColor="text1" w:themeTint="F2"/>
+          <w:sz w:val="22"/>
+          <w:szCs w:val="22"/>
+          <w:lang w:val="en-US"/>
+        </w:rPr>
+        <w:t xml:space="preserve">  , the </w:t>
+      </w:r>
+      <w:r>
+        <w:rPr>
+          <w:b/>
+          <w:bCs/>
+          <w:color w:val="0D0D0D" w:themeColor="text1" w:themeTint="F2"/>
+          <w:sz w:val="22"/>
+          <w:szCs w:val="22"/>
+          <w:lang w:val="en-US"/>
+        </w:rPr>
+        <w:t>checkpoint  :</w:t>
+      </w:r>
+      <w:r>
+        <w:rPr>
+          <w:color w:val="0D0D0D" w:themeColor="text1" w:themeTint="F2"/>
+          <w:sz w:val="22"/>
+          <w:szCs w:val="22"/>
+          <w:lang w:val="en-US"/>
+        </w:rPr>
+        <w:t xml:space="preserve">  </w:t>
+      </w:r>
+      <w:r>
+        <w:rPr>
+          <w:color w:val="0D0D0D" w:themeColor="text1" w:themeTint="F2"/>
+          <w:sz w:val="22"/>
+          <w:szCs w:val="22"/>
+          <w:lang w:val="en-US"/>
+        </w:rPr>
+        <w:t xml:space="preserve">After crossing the lights </w:t>
+      </w:r>
+      <w:r>
+        <w:rPr>
+          <w:color w:val="0D0D0D" w:themeColor="text1" w:themeTint="F2"/>
+          <w:sz w:val="22"/>
+          <w:szCs w:val="22"/>
+          <w:lang w:val="en-US"/>
+        </w:rPr>
+        <w:t xml:space="preserve"> it will </w:t>
+      </w:r>
+      <w:r>
+        <w:rPr>
+          <w:color w:val="0D0D0D" w:themeColor="text1" w:themeTint="F2"/>
+          <w:sz w:val="22"/>
+          <w:szCs w:val="22"/>
+          <w:lang w:val="en-US"/>
+        </w:rPr>
+        <w:t>reduces frustration if spotted</w:t>
+      </w:r>
     </w:p>
     <w:p>
       <w:pPr>
@@ -2727,8 +2293,110 @@
         <w:rPr>
           <w:b/>
           <w:bCs/>
+          <w:color w:val="215E99" w:themeColor="text2" w:themeTint="BF"/>
+          <w:sz w:val="22"/>
+          <w:szCs w:val="22"/>
+        </w:rPr>
+      </w:pPr>
+      <w:r>
+        <w:rPr>
+          <w:b/>
+          <w:bCs/>
+          <w:color w:val="215E99" w:themeColor="text2" w:themeTint="BF"/>
+          <w:sz w:val="22"/>
+          <w:szCs w:val="22"/>
+        </w:rPr>
+        <w:t>Room 3 – Trap Room</w:t>
+      </w:r>
+    </w:p>
+    <w:p>
+      <w:pPr>
+        <w:ind w:left="360"/>
+        <w:jc w:val="both"/>
+        <w:rPr>
+          <w:color w:val="0D0D0D" w:themeColor="text1" w:themeTint="F2"/>
+          <w:sz w:val="22"/>
+          <w:szCs w:val="22"/>
+          <w:lang w:val="en-US"/>
+        </w:rPr>
+      </w:pPr>
+      <w:r>
+        <w:rPr>
+          <w:color w:val="0D0D0D" w:themeColor="text1" w:themeTint="F2"/>
+          <w:sz w:val="22"/>
+          <w:szCs w:val="22"/>
+          <w:lang w:val="en-US"/>
+        </w:rPr>
+        <w:lastRenderedPageBreak/>
+        <w:t>The player avoids noisy traps on the floor while an enemy patrols nearby</w:t>
+      </w:r>
+      <w:r>
+        <w:rPr>
+          <w:color w:val="0D0D0D" w:themeColor="text1" w:themeTint="F2"/>
+          <w:sz w:val="22"/>
+          <w:szCs w:val="22"/>
+          <w:lang w:val="en-US"/>
+        </w:rPr>
+        <w:t xml:space="preserve">  , and </w:t>
+      </w:r>
+      <w:r>
+        <w:rPr>
+          <w:b/>
+          <w:bCs/>
+          <w:color w:val="0D0D0D" w:themeColor="text1" w:themeTint="F2"/>
+          <w:sz w:val="22"/>
+          <w:szCs w:val="22"/>
+          <w:lang w:val="en-US"/>
+        </w:rPr>
+        <w:t>the  checkpoint</w:t>
+      </w:r>
+      <w:r>
+        <w:rPr>
+          <w:color w:val="0D0D0D" w:themeColor="text1" w:themeTint="F2"/>
+          <w:sz w:val="22"/>
+          <w:szCs w:val="22"/>
+          <w:lang w:val="en-US"/>
+        </w:rPr>
+        <w:t xml:space="preserve"> : </w:t>
+      </w:r>
+      <w:r>
+        <w:rPr>
+          <w:color w:val="0D0D0D" w:themeColor="text1" w:themeTint="F2"/>
+          <w:sz w:val="22"/>
+          <w:szCs w:val="22"/>
+          <w:lang w:val="en-US"/>
+        </w:rPr>
+        <w:t xml:space="preserve">After the trap section </w:t>
+      </w:r>
+      <w:r>
+        <w:rPr>
+          <w:color w:val="0D0D0D" w:themeColor="text1" w:themeTint="F2"/>
+          <w:sz w:val="22"/>
+          <w:szCs w:val="22"/>
+          <w:lang w:val="en-US"/>
+        </w:rPr>
+        <w:t>,</w:t>
+      </w:r>
+      <w:r>
+        <w:rPr>
+          <w:color w:val="0D0D0D" w:themeColor="text1" w:themeTint="F2"/>
+          <w:sz w:val="22"/>
+          <w:szCs w:val="22"/>
+          <w:lang w:val="en-US"/>
+        </w:rPr>
+        <w:t xml:space="preserve"> prevents repeating slow sneaking</w:t>
+      </w:r>
+    </w:p>
+    <w:p>
+      <w:pPr>
+        <w:ind w:left="360"/>
+        <w:jc w:val="both"/>
+        <w:rPr>
+          <w:b/>
+          <w:bCs/>
           <w:color w:val="153D63" w:themeColor="text2" w:themeTint="E6"/>
-          <w:lang w:val="en-US"/>
+          <w:sz w:val="22"/>
+          <w:szCs w:val="22"/>
         </w:rPr>
       </w:pPr>
       <w:r>
@@ -2736,9 +2404,281 @@
           <w:b/>
           <w:bCs/>
           <w:color w:val="153D63" w:themeColor="text2" w:themeTint="E6"/>
+          <w:sz w:val="22"/>
+          <w:szCs w:val="22"/>
+        </w:rPr>
+        <w:t>Room 4 – Final Door Escape</w:t>
+      </w:r>
+    </w:p>
+    <w:p>
+      <w:pPr>
+        <w:ind w:left="360"/>
+        <w:jc w:val="both"/>
+        <w:rPr>
+          <w:color w:val="0D0D0D" w:themeColor="text1" w:themeTint="F2"/>
+          <w:sz w:val="22"/>
+          <w:szCs w:val="22"/>
+          <w:lang w:val="en-US"/>
+        </w:rPr>
+      </w:pPr>
+      <w:r>
+        <w:rPr>
+          <w:b/>
+          <w:bCs/>
+          <w:color w:val="153D63" w:themeColor="text2" w:themeTint="E6"/>
+          <w:sz w:val="22"/>
+          <w:szCs w:val="22"/>
+        </w:rPr>
+        <w:tab/>
+      </w:r>
+      <w:r>
+        <w:rPr>
+          <w:color w:val="0D0D0D" w:themeColor="text1" w:themeTint="F2"/>
+          <w:sz w:val="22"/>
+          <w:szCs w:val="22"/>
+          <w:lang w:val="en-US"/>
+        </w:rPr>
+        <w:t>The player runs to a locked door and must hide quickly while it opens</w:t>
+      </w:r>
+      <w:r>
+        <w:rPr>
+          <w:color w:val="0D0D0D" w:themeColor="text1" w:themeTint="F2"/>
+          <w:sz w:val="22"/>
+          <w:szCs w:val="22"/>
+          <w:lang w:val="en-US"/>
+        </w:rPr>
+        <w:t xml:space="preserve"> , the </w:t>
+      </w:r>
+      <w:r>
+        <w:rPr>
+          <w:b/>
+          <w:bCs/>
+          <w:color w:val="0D0D0D" w:themeColor="text1" w:themeTint="F2"/>
+          <w:sz w:val="22"/>
+          <w:szCs w:val="22"/>
+          <w:lang w:val="en-US"/>
+        </w:rPr>
+        <w:t xml:space="preserve">checkpoint </w:t>
+      </w:r>
+      <w:r>
+        <w:rPr>
+          <w:color w:val="0D0D0D" w:themeColor="text1" w:themeTint="F2"/>
+          <w:sz w:val="22"/>
+          <w:szCs w:val="22"/>
+          <w:lang w:val="en-US"/>
+        </w:rPr>
+        <w:t>is : r</w:t>
+      </w:r>
+      <w:r>
+        <w:rPr>
+          <w:color w:val="0D0D0D" w:themeColor="text1" w:themeTint="F2"/>
+          <w:sz w:val="22"/>
+          <w:szCs w:val="22"/>
+          <w:lang w:val="en-US"/>
+        </w:rPr>
+        <w:t xml:space="preserve">ight before the door </w:t>
+      </w:r>
+      <w:r>
+        <w:rPr>
+          <w:color w:val="0D0D0D" w:themeColor="text1" w:themeTint="F2"/>
+          <w:sz w:val="22"/>
+          <w:szCs w:val="22"/>
+          <w:lang w:val="en-US"/>
+        </w:rPr>
+        <w:t>it will</w:t>
+      </w:r>
+      <w:r>
+        <w:rPr>
+          <w:color w:val="0D0D0D" w:themeColor="text1" w:themeTint="F2"/>
+          <w:sz w:val="22"/>
+          <w:szCs w:val="22"/>
+          <w:lang w:val="en-US"/>
+        </w:rPr>
+        <w:t xml:space="preserve"> makes the final moment less stressful</w:t>
+      </w:r>
+    </w:p>
+    <w:p>
+      <w:pPr>
+        <w:ind w:left="360"/>
+        <w:jc w:val="both"/>
+        <w:rPr>
+          <w:b/>
+          <w:bCs/>
+          <w:color w:val="153D63" w:themeColor="text2" w:themeTint="E6"/>
+          <w:lang w:val="en-US"/>
+        </w:rPr>
+      </w:pPr>
+    </w:p>
+    <w:p>
+      <w:pPr>
+        <w:ind w:left="360"/>
+        <w:jc w:val="both"/>
+        <w:rPr>
+          <w:b/>
+          <w:bCs/>
+          <w:color w:val="EE0000"/>
+        </w:rPr>
+      </w:pPr>
+      <w:r>
+        <w:rPr>
+          <w:b/>
+          <w:bCs/>
+          <w:color w:val="EE0000"/>
+        </w:rPr>
+        <w:t>Exercice: UX &amp; Accessibility</w:t>
+      </w:r>
+    </w:p>
+    <w:p>
+      <w:pPr>
+        <w:ind w:left="360"/>
+        <w:jc w:val="both"/>
+        <w:rPr>
+          <w:color w:val="215E99" w:themeColor="text2" w:themeTint="BF"/>
+        </w:rPr>
+      </w:pPr>
+      <w:r>
+        <w:rPr>
+          <w:color w:val="215E99" w:themeColor="text2" w:themeTint="BF"/>
+        </w:rPr>
+        <w:t xml:space="preserve">1-- </w:t>
+      </w:r>
+      <w:r>
+        <w:rPr>
+          <w:color w:val="215E99" w:themeColor="text2" w:themeTint="BF"/>
+        </w:rPr>
+        <w:t>2 Accessibility Features</w:t>
+      </w:r>
+      <w:r>
+        <w:rPr>
+          <w:color w:val="215E99" w:themeColor="text2" w:themeTint="BF"/>
+        </w:rPr>
+        <w:t> :</w:t>
+      </w:r>
+    </w:p>
+    <w:p>
+      <w:pPr>
+        <w:ind w:left="360"/>
+        <w:jc w:val="both"/>
+        <w:rPr>
+          <w:color w:val="00B050"/>
+          <w:lang w:val="en-US"/>
+        </w:rPr>
+      </w:pPr>
+      <w:r>
+        <w:rPr>
+          <w:color w:val="00B050"/>
+          <w:lang w:val="en-US"/>
+        </w:rPr>
+        <w:t>Subtitle option</w:t>
+      </w:r>
+      <w:r>
+        <w:rPr>
+          <w:color w:val="00B050"/>
+          <w:lang w:val="en-US"/>
+        </w:rPr>
+        <w:t xml:space="preserve"> : </w:t>
+      </w:r>
+      <w:r>
+        <w:rPr>
+          <w:color w:val="0D0D0D" w:themeColor="text1" w:themeTint="F2"/>
+          <w:lang w:val="en-US"/>
+        </w:rPr>
+        <w:t>apper in s</w:t>
+      </w:r>
+      <w:r>
+        <w:rPr>
+          <w:color w:val="0D0D0D" w:themeColor="text1" w:themeTint="F2"/>
+          <w:lang w:val="en-US"/>
+        </w:rPr>
+        <w:t xml:space="preserve">etting menu for all sounds and enemy noise </w:t>
+      </w:r>
+    </w:p>
+    <w:p>
+      <w:pPr>
+        <w:ind w:left="360"/>
+        <w:jc w:val="both"/>
+        <w:rPr>
+          <w:color w:val="0D0D0D" w:themeColor="text1" w:themeTint="F2"/>
+          <w:lang w:val="en-US"/>
+        </w:rPr>
+      </w:pPr>
+      <w:r>
+        <w:rPr>
+          <w:b/>
+          <w:bCs/>
+          <w:color w:val="153D63" w:themeColor="text2" w:themeTint="E6"/>
           <w:lang w:val="en-US"/>
         </w:rPr>
         <w:t xml:space="preserve">      </w:t>
+      </w:r>
+      <w:r>
+        <w:rPr>
+          <w:color w:val="00B050"/>
+          <w:lang w:val="en-US"/>
+        </w:rPr>
+        <w:t>Brightness slider</w:t>
+      </w:r>
+      <w:r>
+        <w:rPr>
+          <w:color w:val="00B050"/>
+          <w:lang w:val="en-US"/>
+        </w:rPr>
+        <w:t xml:space="preserve"> : </w:t>
+      </w:r>
+      <w:r>
+        <w:rPr>
+          <w:color w:val="0D0D0D" w:themeColor="text1" w:themeTint="F2"/>
+          <w:lang w:val="en-US"/>
+        </w:rPr>
+        <w:t xml:space="preserve">appear in </w:t>
+      </w:r>
+      <w:r>
+        <w:rPr>
+          <w:color w:val="0D0D0D" w:themeColor="text1" w:themeTint="F2"/>
+          <w:lang w:val="en-US"/>
+        </w:rPr>
+        <w:t xml:space="preserve">video setting to help the player see in dark areas </w:t>
+      </w:r>
+    </w:p>
+    <w:p>
+      <w:pPr>
+        <w:ind w:left="360"/>
+        <w:jc w:val="both"/>
+        <w:rPr>
+          <w:color w:val="153D63" w:themeColor="text2" w:themeTint="E6"/>
+          <w:lang w:val="en-US"/>
+        </w:rPr>
+      </w:pPr>
+      <w:r>
+        <w:rPr>
+          <w:color w:val="153D63" w:themeColor="text2" w:themeTint="E6"/>
+          <w:lang w:val="en-US"/>
+        </w:rPr>
+        <w:t>2—the exact text of one helpful in game prompt :</w:t>
+      </w:r>
+    </w:p>
+    <w:p>
+      <w:pPr>
+        <w:ind w:left="360"/>
+        <w:jc w:val="both"/>
+        <w:rPr>
+          <w:color w:val="0D0D0D" w:themeColor="text1" w:themeTint="F2"/>
+          <w:lang w:val="en-US"/>
+        </w:rPr>
+      </w:pPr>
+      <w:r>
+        <w:rPr>
+          <w:color w:val="0D0D0D" w:themeColor="text1" w:themeTint="F2"/>
+          <w:lang w:val="en-US"/>
+        </w:rPr>
+        <w:t xml:space="preserve"> </w:t>
+      </w:r>
+      <w:r>
+        <w:rPr>
+          <w:color w:val="0D0D0D" w:themeColor="text1" w:themeTint="F2"/>
+          <w:lang w:val="en-US"/>
+        </w:rPr>
+        <w:t>Be quiet. Noise can attract enemies</w:t>
       </w:r>
     </w:p>
     <w:p>

</xml_diff>